<commit_message>
Ajustados DU y web
</commit_message>
<xml_diff>
--- a/fuentes/CF01_93610220_DU.docx
+++ b/fuentes/CF01_93610220_DU.docx
@@ -534,7 +534,7 @@
           <w:r>
             <w:fldChar w:fldCharType="separate"/>
           </w:r>
-          <w:hyperlink w:anchor="_Toc202291827" w:history="1">
+          <w:hyperlink w:anchor="_Toc202984693" w:history="1">
             <w:r>
               <w:rPr>
                 <w:rStyle w:val="Hipervnculo"/>
@@ -561,7 +561,7 @@
                 <w:noProof/>
                 <w:webHidden/>
               </w:rPr>
-              <w:instrText xml:space="preserve"> PAGEREF _Toc202291827 \h </w:instrText>
+              <w:instrText xml:space="preserve"> PAGEREF _Toc202984693 \h </w:instrText>
             </w:r>
             <w:r>
               <w:rPr>
@@ -607,7 +607,7 @@
               <w:lang w:eastAsia="es-MX"/>
             </w:rPr>
           </w:pPr>
-          <w:hyperlink w:anchor="_Toc202291828" w:history="1">
+          <w:hyperlink w:anchor="_Toc202984694" w:history="1">
             <w:r>
               <w:rPr>
                 <w:rStyle w:val="Hipervnculo"/>
@@ -651,7 +651,7 @@
                 <w:noProof/>
                 <w:webHidden/>
               </w:rPr>
-              <w:instrText xml:space="preserve"> PAGEREF _Toc202291828 \h </w:instrText>
+              <w:instrText xml:space="preserve"> PAGEREF _Toc202984694 \h </w:instrText>
             </w:r>
             <w:r>
               <w:rPr>
@@ -693,13 +693,13 @@
               <w:lang w:eastAsia="es-MX"/>
             </w:rPr>
           </w:pPr>
-          <w:hyperlink w:anchor="_Toc202291829" w:history="1">
+          <w:hyperlink w:anchor="_Toc202984695" w:history="1">
             <w:r>
               <w:rPr>
                 <w:rStyle w:val="Hipervnculo"/>
                 <w:noProof/>
               </w:rPr>
-              <w:t>Diferencia entre frutas y verduras</w:t>
+              <w:t>1.1 Diferencia entre frutas y verduras</w:t>
             </w:r>
             <w:r>
               <w:rPr>
@@ -720,7 +720,7 @@
                 <w:noProof/>
                 <w:webHidden/>
               </w:rPr>
-              <w:instrText xml:space="preserve"> PAGEREF _Toc202291829 \h </w:instrText>
+              <w:instrText xml:space="preserve"> PAGEREF _Toc202984695 \h </w:instrText>
             </w:r>
             <w:r>
               <w:rPr>
@@ -762,13 +762,13 @@
               <w:lang w:eastAsia="es-MX"/>
             </w:rPr>
           </w:pPr>
-          <w:hyperlink w:anchor="_Toc202291830" w:history="1">
+          <w:hyperlink w:anchor="_Toc202984696" w:history="1">
             <w:r>
               <w:rPr>
                 <w:rStyle w:val="Hipervnculo"/>
                 <w:noProof/>
               </w:rPr>
-              <w:t>Clasificación de las frutas</w:t>
+              <w:t>1.2 Clasificación de las frutas</w:t>
             </w:r>
             <w:r>
               <w:rPr>
@@ -789,7 +789,7 @@
                 <w:noProof/>
                 <w:webHidden/>
               </w:rPr>
-              <w:instrText xml:space="preserve"> PAGEREF _Toc202291830 \h </w:instrText>
+              <w:instrText xml:space="preserve"> PAGEREF _Toc202984696 \h </w:instrText>
             </w:r>
             <w:r>
               <w:rPr>
@@ -831,13 +831,13 @@
               <w:lang w:eastAsia="es-MX"/>
             </w:rPr>
           </w:pPr>
-          <w:hyperlink w:anchor="_Toc202291831" w:history="1">
+          <w:hyperlink w:anchor="_Toc202984697" w:history="1">
             <w:r>
               <w:rPr>
                 <w:rStyle w:val="Hipervnculo"/>
                 <w:noProof/>
               </w:rPr>
-              <w:t>Clasificación de las verduras</w:t>
+              <w:t>1.3 Clasificación de las verduras</w:t>
             </w:r>
             <w:r>
               <w:rPr>
@@ -858,7 +858,7 @@
                 <w:noProof/>
                 <w:webHidden/>
               </w:rPr>
-              <w:instrText xml:space="preserve"> PAGEREF _Toc202291831 \h </w:instrText>
+              <w:instrText xml:space="preserve"> PAGEREF _Toc202984697 \h </w:instrText>
             </w:r>
             <w:r>
               <w:rPr>
@@ -904,7 +904,7 @@
               <w:lang w:eastAsia="es-MX"/>
             </w:rPr>
           </w:pPr>
-          <w:hyperlink w:anchor="_Toc202291832" w:history="1">
+          <w:hyperlink w:anchor="_Toc202984698" w:history="1">
             <w:r>
               <w:rPr>
                 <w:rStyle w:val="Hipervnculo"/>
@@ -948,7 +948,7 @@
                 <w:noProof/>
                 <w:webHidden/>
               </w:rPr>
-              <w:instrText xml:space="preserve"> PAGEREF _Toc202291832 \h </w:instrText>
+              <w:instrText xml:space="preserve"> PAGEREF _Toc202984698 \h </w:instrText>
             </w:r>
             <w:r>
               <w:rPr>
@@ -990,7 +990,7 @@
               <w:lang w:eastAsia="es-MX"/>
             </w:rPr>
           </w:pPr>
-          <w:hyperlink w:anchor="_Toc202291833" w:history="1">
+          <w:hyperlink w:anchor="_Toc202984699" w:history="1">
             <w:r>
               <w:rPr>
                 <w:rStyle w:val="Hipervnculo"/>
@@ -1034,7 +1034,7 @@
                 <w:noProof/>
                 <w:webHidden/>
               </w:rPr>
-              <w:instrText xml:space="preserve"> PAGEREF _Toc202291833 \h </w:instrText>
+              <w:instrText xml:space="preserve"> PAGEREF _Toc202984699 \h </w:instrText>
             </w:r>
             <w:r>
               <w:rPr>
@@ -1076,7 +1076,7 @@
               <w:lang w:eastAsia="es-MX"/>
             </w:rPr>
           </w:pPr>
-          <w:hyperlink w:anchor="_Toc202291834" w:history="1">
+          <w:hyperlink w:anchor="_Toc202984700" w:history="1">
             <w:r>
               <w:rPr>
                 <w:rStyle w:val="Hipervnculo"/>
@@ -1120,7 +1120,7 @@
                 <w:noProof/>
                 <w:webHidden/>
               </w:rPr>
-              <w:instrText xml:space="preserve"> PAGEREF _Toc202291834 \h </w:instrText>
+              <w:instrText xml:space="preserve"> PAGEREF _Toc202984700 \h </w:instrText>
             </w:r>
             <w:r>
               <w:rPr>
@@ -1162,7 +1162,7 @@
               <w:lang w:eastAsia="es-MX"/>
             </w:rPr>
           </w:pPr>
-          <w:hyperlink w:anchor="_Toc202291835" w:history="1">
+          <w:hyperlink w:anchor="_Toc202984701" w:history="1">
             <w:r>
               <w:rPr>
                 <w:rStyle w:val="Hipervnculo"/>
@@ -1206,7 +1206,7 @@
                 <w:noProof/>
                 <w:webHidden/>
               </w:rPr>
-              <w:instrText xml:space="preserve"> PAGEREF _Toc202291835 \h </w:instrText>
+              <w:instrText xml:space="preserve"> PAGEREF _Toc202984701 \h </w:instrText>
             </w:r>
             <w:r>
               <w:rPr>
@@ -1248,7 +1248,7 @@
               <w:lang w:eastAsia="es-MX"/>
             </w:rPr>
           </w:pPr>
-          <w:hyperlink w:anchor="_Toc202291836" w:history="1">
+          <w:hyperlink w:anchor="_Toc202984702" w:history="1">
             <w:r>
               <w:rPr>
                 <w:rStyle w:val="Hipervnculo"/>
@@ -1292,7 +1292,7 @@
                 <w:noProof/>
                 <w:webHidden/>
               </w:rPr>
-              <w:instrText xml:space="preserve"> PAGEREF _Toc202291836 \h </w:instrText>
+              <w:instrText xml:space="preserve"> PAGEREF _Toc202984702 \h </w:instrText>
             </w:r>
             <w:r>
               <w:rPr>
@@ -1334,7 +1334,7 @@
               <w:lang w:eastAsia="es-MX"/>
             </w:rPr>
           </w:pPr>
-          <w:hyperlink w:anchor="_Toc202291837" w:history="1">
+          <w:hyperlink w:anchor="_Toc202984703" w:history="1">
             <w:r>
               <w:rPr>
                 <w:rStyle w:val="Hipervnculo"/>
@@ -1378,7 +1378,7 @@
                 <w:noProof/>
                 <w:webHidden/>
               </w:rPr>
-              <w:instrText xml:space="preserve"> PAGEREF _Toc202291837 \h </w:instrText>
+              <w:instrText xml:space="preserve"> PAGEREF _Toc202984703 \h </w:instrText>
             </w:r>
             <w:r>
               <w:rPr>
@@ -1424,7 +1424,7 @@
               <w:lang w:eastAsia="es-MX"/>
             </w:rPr>
           </w:pPr>
-          <w:hyperlink w:anchor="_Toc202291838" w:history="1">
+          <w:hyperlink w:anchor="_Toc202984704" w:history="1">
             <w:r>
               <w:rPr>
                 <w:rStyle w:val="Hipervnculo"/>
@@ -1468,7 +1468,7 @@
                 <w:noProof/>
                 <w:webHidden/>
               </w:rPr>
-              <w:instrText xml:space="preserve"> PAGEREF _Toc202291838 \h </w:instrText>
+              <w:instrText xml:space="preserve"> PAGEREF _Toc202984704 \h </w:instrText>
             </w:r>
             <w:r>
               <w:rPr>
@@ -1510,7 +1510,7 @@
               <w:lang w:eastAsia="es-MX"/>
             </w:rPr>
           </w:pPr>
-          <w:hyperlink w:anchor="_Toc202291839" w:history="1">
+          <w:hyperlink w:anchor="_Toc202984705" w:history="1">
             <w:r>
               <w:rPr>
                 <w:rStyle w:val="Hipervnculo"/>
@@ -1554,7 +1554,7 @@
                 <w:noProof/>
                 <w:webHidden/>
               </w:rPr>
-              <w:instrText xml:space="preserve"> PAGEREF _Toc202291839 \h </w:instrText>
+              <w:instrText xml:space="preserve"> PAGEREF _Toc202984705 \h </w:instrText>
             </w:r>
             <w:r>
               <w:rPr>
@@ -1596,7 +1596,7 @@
               <w:lang w:eastAsia="es-MX"/>
             </w:rPr>
           </w:pPr>
-          <w:hyperlink w:anchor="_Toc202291840" w:history="1">
+          <w:hyperlink w:anchor="_Toc202984706" w:history="1">
             <w:r>
               <w:rPr>
                 <w:rStyle w:val="Hipervnculo"/>
@@ -1640,7 +1640,7 @@
                 <w:noProof/>
                 <w:webHidden/>
               </w:rPr>
-              <w:instrText xml:space="preserve"> PAGEREF _Toc202291840 \h </w:instrText>
+              <w:instrText xml:space="preserve"> PAGEREF _Toc202984706 \h </w:instrText>
             </w:r>
             <w:r>
               <w:rPr>
@@ -1686,7 +1686,7 @@
               <w:lang w:eastAsia="es-MX"/>
             </w:rPr>
           </w:pPr>
-          <w:hyperlink w:anchor="_Toc202291841" w:history="1">
+          <w:hyperlink w:anchor="_Toc202984707" w:history="1">
             <w:r>
               <w:rPr>
                 <w:rStyle w:val="Hipervnculo"/>
@@ -1730,7 +1730,7 @@
                 <w:noProof/>
                 <w:webHidden/>
               </w:rPr>
-              <w:instrText xml:space="preserve"> PAGEREF _Toc202291841 \h </w:instrText>
+              <w:instrText xml:space="preserve"> PAGEREF _Toc202984707 \h </w:instrText>
             </w:r>
             <w:r>
               <w:rPr>
@@ -1772,7 +1772,7 @@
               <w:lang w:eastAsia="es-MX"/>
             </w:rPr>
           </w:pPr>
-          <w:hyperlink w:anchor="_Toc202291842" w:history="1">
+          <w:hyperlink w:anchor="_Toc202984708" w:history="1">
             <w:r>
               <w:rPr>
                 <w:rStyle w:val="Hipervnculo"/>
@@ -1816,7 +1816,7 @@
                 <w:noProof/>
                 <w:webHidden/>
               </w:rPr>
-              <w:instrText xml:space="preserve"> PAGEREF _Toc202291842 \h </w:instrText>
+              <w:instrText xml:space="preserve"> PAGEREF _Toc202984708 \h </w:instrText>
             </w:r>
             <w:r>
               <w:rPr>
@@ -1858,7 +1858,7 @@
               <w:lang w:eastAsia="es-MX"/>
             </w:rPr>
           </w:pPr>
-          <w:hyperlink w:anchor="_Toc202291843" w:history="1">
+          <w:hyperlink w:anchor="_Toc202984709" w:history="1">
             <w:r>
               <w:rPr>
                 <w:rStyle w:val="Hipervnculo"/>
@@ -1902,7 +1902,7 @@
                 <w:noProof/>
                 <w:webHidden/>
               </w:rPr>
-              <w:instrText xml:space="preserve"> PAGEREF _Toc202291843 \h </w:instrText>
+              <w:instrText xml:space="preserve"> PAGEREF _Toc202984709 \h </w:instrText>
             </w:r>
             <w:r>
               <w:rPr>
@@ -1948,7 +1948,7 @@
               <w:lang w:eastAsia="es-MX"/>
             </w:rPr>
           </w:pPr>
-          <w:hyperlink w:anchor="_Toc202291844" w:history="1">
+          <w:hyperlink w:anchor="_Toc202984710" w:history="1">
             <w:r>
               <w:rPr>
                 <w:rStyle w:val="Hipervnculo"/>
@@ -1992,7 +1992,7 @@
                 <w:noProof/>
                 <w:webHidden/>
               </w:rPr>
-              <w:instrText xml:space="preserve"> PAGEREF _Toc202291844 \h </w:instrText>
+              <w:instrText xml:space="preserve"> PAGEREF _Toc202984710 \h </w:instrText>
             </w:r>
             <w:r>
               <w:rPr>
@@ -2034,7 +2034,7 @@
               <w:lang w:eastAsia="es-MX"/>
             </w:rPr>
           </w:pPr>
-          <w:hyperlink w:anchor="_Toc202291845" w:history="1">
+          <w:hyperlink w:anchor="_Toc202984711" w:history="1">
             <w:r>
               <w:rPr>
                 <w:rStyle w:val="Hipervnculo"/>
@@ -2061,7 +2061,7 @@
                 <w:noProof/>
                 <w:webHidden/>
               </w:rPr>
-              <w:instrText xml:space="preserve"> PAGEREF _Toc202291845 \h </w:instrText>
+              <w:instrText xml:space="preserve"> PAGEREF _Toc202984711 \h </w:instrText>
             </w:r>
             <w:r>
               <w:rPr>
@@ -2103,7 +2103,7 @@
               <w:lang w:eastAsia="es-MX"/>
             </w:rPr>
           </w:pPr>
-          <w:hyperlink w:anchor="_Toc202291846" w:history="1">
+          <w:hyperlink w:anchor="_Toc202984712" w:history="1">
             <w:r>
               <w:rPr>
                 <w:rStyle w:val="Hipervnculo"/>
@@ -2130,7 +2130,7 @@
                 <w:noProof/>
                 <w:webHidden/>
               </w:rPr>
-              <w:instrText xml:space="preserve"> PAGEREF _Toc202291846 \h </w:instrText>
+              <w:instrText xml:space="preserve"> PAGEREF _Toc202984712 \h </w:instrText>
             </w:r>
             <w:r>
               <w:rPr>
@@ -2172,7 +2172,7 @@
               <w:lang w:eastAsia="es-MX"/>
             </w:rPr>
           </w:pPr>
-          <w:hyperlink w:anchor="_Toc202291847" w:history="1">
+          <w:hyperlink w:anchor="_Toc202984713" w:history="1">
             <w:r>
               <w:rPr>
                 <w:rStyle w:val="Hipervnculo"/>
@@ -2199,7 +2199,7 @@
                 <w:noProof/>
                 <w:webHidden/>
               </w:rPr>
-              <w:instrText xml:space="preserve"> PAGEREF _Toc202291847 \h </w:instrText>
+              <w:instrText xml:space="preserve"> PAGEREF _Toc202984713 \h </w:instrText>
             </w:r>
             <w:r>
               <w:rPr>
@@ -2245,7 +2245,7 @@
               <w:lang w:eastAsia="es-MX"/>
             </w:rPr>
           </w:pPr>
-          <w:hyperlink w:anchor="_Toc202291848" w:history="1">
+          <w:hyperlink w:anchor="_Toc202984714" w:history="1">
             <w:r>
               <w:rPr>
                 <w:rStyle w:val="Hipervnculo"/>
@@ -2289,7 +2289,7 @@
                 <w:noProof/>
                 <w:webHidden/>
               </w:rPr>
-              <w:instrText xml:space="preserve"> PAGEREF _Toc202291848 \h </w:instrText>
+              <w:instrText xml:space="preserve"> PAGEREF _Toc202984714 \h </w:instrText>
             </w:r>
             <w:r>
               <w:rPr>
@@ -2331,7 +2331,7 @@
               <w:lang w:eastAsia="es-MX"/>
             </w:rPr>
           </w:pPr>
-          <w:hyperlink w:anchor="_Toc202291849" w:history="1">
+          <w:hyperlink w:anchor="_Toc202984715" w:history="1">
             <w:r>
               <w:rPr>
                 <w:rStyle w:val="Hipervnculo"/>
@@ -2375,7 +2375,7 @@
                 <w:noProof/>
                 <w:webHidden/>
               </w:rPr>
-              <w:instrText xml:space="preserve"> PAGEREF _Toc202291849 \h </w:instrText>
+              <w:instrText xml:space="preserve"> PAGEREF _Toc202984715 \h </w:instrText>
             </w:r>
             <w:r>
               <w:rPr>
@@ -2417,7 +2417,7 @@
               <w:lang w:eastAsia="es-MX"/>
             </w:rPr>
           </w:pPr>
-          <w:hyperlink w:anchor="_Toc202291850" w:history="1">
+          <w:hyperlink w:anchor="_Toc202984716" w:history="1">
             <w:r>
               <w:rPr>
                 <w:rStyle w:val="Hipervnculo"/>
@@ -2461,7 +2461,7 @@
                 <w:noProof/>
                 <w:webHidden/>
               </w:rPr>
-              <w:instrText xml:space="preserve"> PAGEREF _Toc202291850 \h </w:instrText>
+              <w:instrText xml:space="preserve"> PAGEREF _Toc202984716 \h </w:instrText>
             </w:r>
             <w:r>
               <w:rPr>
@@ -2503,7 +2503,7 @@
               <w:lang w:eastAsia="es-MX"/>
             </w:rPr>
           </w:pPr>
-          <w:hyperlink w:anchor="_Toc202291851" w:history="1">
+          <w:hyperlink w:anchor="_Toc202984717" w:history="1">
             <w:r>
               <w:rPr>
                 <w:rStyle w:val="Hipervnculo"/>
@@ -2547,7 +2547,7 @@
                 <w:noProof/>
                 <w:webHidden/>
               </w:rPr>
-              <w:instrText xml:space="preserve"> PAGEREF _Toc202291851 \h </w:instrText>
+              <w:instrText xml:space="preserve"> PAGEREF _Toc202984717 \h </w:instrText>
             </w:r>
             <w:r>
               <w:rPr>
@@ -2593,7 +2593,7 @@
               <w:lang w:eastAsia="es-MX"/>
             </w:rPr>
           </w:pPr>
-          <w:hyperlink w:anchor="_Toc202291852" w:history="1">
+          <w:hyperlink w:anchor="_Toc202984718" w:history="1">
             <w:r>
               <w:rPr>
                 <w:rStyle w:val="Hipervnculo"/>
@@ -2637,7 +2637,7 @@
                 <w:noProof/>
                 <w:webHidden/>
               </w:rPr>
-              <w:instrText xml:space="preserve"> PAGEREF _Toc202291852 \h </w:instrText>
+              <w:instrText xml:space="preserve"> PAGEREF _Toc202984718 \h </w:instrText>
             </w:r>
             <w:r>
               <w:rPr>
@@ -2679,7 +2679,7 @@
               <w:lang w:eastAsia="es-MX"/>
             </w:rPr>
           </w:pPr>
-          <w:hyperlink w:anchor="_Toc202291853" w:history="1">
+          <w:hyperlink w:anchor="_Toc202984719" w:history="1">
             <w:r>
               <w:rPr>
                 <w:rStyle w:val="Hipervnculo"/>
@@ -2723,7 +2723,7 @@
                 <w:noProof/>
                 <w:webHidden/>
               </w:rPr>
-              <w:instrText xml:space="preserve"> PAGEREF _Toc202291853 \h </w:instrText>
+              <w:instrText xml:space="preserve"> PAGEREF _Toc202984719 \h </w:instrText>
             </w:r>
             <w:r>
               <w:rPr>
@@ -2765,7 +2765,7 @@
               <w:lang w:eastAsia="es-MX"/>
             </w:rPr>
           </w:pPr>
-          <w:hyperlink w:anchor="_Toc202291854" w:history="1">
+          <w:hyperlink w:anchor="_Toc202984720" w:history="1">
             <w:r>
               <w:rPr>
                 <w:rStyle w:val="Hipervnculo"/>
@@ -2809,7 +2809,7 @@
                 <w:noProof/>
                 <w:webHidden/>
               </w:rPr>
-              <w:instrText xml:space="preserve"> PAGEREF _Toc202291854 \h </w:instrText>
+              <w:instrText xml:space="preserve"> PAGEREF _Toc202984720 \h </w:instrText>
             </w:r>
             <w:r>
               <w:rPr>
@@ -2851,7 +2851,7 @@
               <w:lang w:eastAsia="es-MX"/>
             </w:rPr>
           </w:pPr>
-          <w:hyperlink w:anchor="_Toc202291855" w:history="1">
+          <w:hyperlink w:anchor="_Toc202984721" w:history="1">
             <w:r>
               <w:rPr>
                 <w:rStyle w:val="Hipervnculo"/>
@@ -2895,7 +2895,7 @@
                 <w:noProof/>
                 <w:webHidden/>
               </w:rPr>
-              <w:instrText xml:space="preserve"> PAGEREF _Toc202291855 \h </w:instrText>
+              <w:instrText xml:space="preserve"> PAGEREF _Toc202984721 \h </w:instrText>
             </w:r>
             <w:r>
               <w:rPr>
@@ -2937,7 +2937,7 @@
               <w:lang w:eastAsia="es-MX"/>
             </w:rPr>
           </w:pPr>
-          <w:hyperlink w:anchor="_Toc202291856" w:history="1">
+          <w:hyperlink w:anchor="_Toc202984722" w:history="1">
             <w:r>
               <w:rPr>
                 <w:rStyle w:val="Hipervnculo"/>
@@ -2981,7 +2981,7 @@
                 <w:noProof/>
                 <w:webHidden/>
               </w:rPr>
-              <w:instrText xml:space="preserve"> PAGEREF _Toc202291856 \h </w:instrText>
+              <w:instrText xml:space="preserve"> PAGEREF _Toc202984722 \h </w:instrText>
             </w:r>
             <w:r>
               <w:rPr>
@@ -3026,7 +3026,7 @@
               <w:lang w:eastAsia="es-MX"/>
             </w:rPr>
           </w:pPr>
-          <w:hyperlink w:anchor="_Toc202291857" w:history="1">
+          <w:hyperlink w:anchor="_Toc202984723" w:history="1">
             <w:r>
               <w:rPr>
                 <w:rStyle w:val="Hipervnculo"/>
@@ -3053,7 +3053,7 @@
                 <w:noProof/>
                 <w:webHidden/>
               </w:rPr>
-              <w:instrText xml:space="preserve"> PAGEREF _Toc202291857 \h </w:instrText>
+              <w:instrText xml:space="preserve"> PAGEREF _Toc202984723 \h </w:instrText>
             </w:r>
             <w:r>
               <w:rPr>
@@ -3098,7 +3098,7 @@
               <w:lang w:eastAsia="es-MX"/>
             </w:rPr>
           </w:pPr>
-          <w:hyperlink w:anchor="_Toc202291858" w:history="1">
+          <w:hyperlink w:anchor="_Toc202984724" w:history="1">
             <w:r>
               <w:rPr>
                 <w:rStyle w:val="Hipervnculo"/>
@@ -3125,7 +3125,7 @@
                 <w:noProof/>
                 <w:webHidden/>
               </w:rPr>
-              <w:instrText xml:space="preserve"> PAGEREF _Toc202291858 \h </w:instrText>
+              <w:instrText xml:space="preserve"> PAGEREF _Toc202984724 \h </w:instrText>
             </w:r>
             <w:r>
               <w:rPr>
@@ -3170,7 +3170,7 @@
               <w:lang w:eastAsia="es-MX"/>
             </w:rPr>
           </w:pPr>
-          <w:hyperlink w:anchor="_Toc202291859" w:history="1">
+          <w:hyperlink w:anchor="_Toc202984725" w:history="1">
             <w:r>
               <w:rPr>
                 <w:rStyle w:val="Hipervnculo"/>
@@ -3197,7 +3197,7 @@
                 <w:noProof/>
                 <w:webHidden/>
               </w:rPr>
-              <w:instrText xml:space="preserve"> PAGEREF _Toc202291859 \h </w:instrText>
+              <w:instrText xml:space="preserve"> PAGEREF _Toc202984725 \h </w:instrText>
             </w:r>
             <w:r>
               <w:rPr>
@@ -3242,7 +3242,7 @@
               <w:lang w:eastAsia="es-MX"/>
             </w:rPr>
           </w:pPr>
-          <w:hyperlink w:anchor="_Toc202291860" w:history="1">
+          <w:hyperlink w:anchor="_Toc202984726" w:history="1">
             <w:r>
               <w:rPr>
                 <w:rStyle w:val="Hipervnculo"/>
@@ -3269,7 +3269,7 @@
                 <w:noProof/>
                 <w:webHidden/>
               </w:rPr>
-              <w:instrText xml:space="preserve"> PAGEREF _Toc202291860 \h </w:instrText>
+              <w:instrText xml:space="preserve"> PAGEREF _Toc202984726 \h </w:instrText>
             </w:r>
             <w:r>
               <w:rPr>
@@ -3314,7 +3314,7 @@
               <w:lang w:eastAsia="es-MX"/>
             </w:rPr>
           </w:pPr>
-          <w:hyperlink w:anchor="_Toc202291861" w:history="1">
+          <w:hyperlink w:anchor="_Toc202984727" w:history="1">
             <w:r>
               <w:rPr>
                 <w:rStyle w:val="Hipervnculo"/>
@@ -3341,7 +3341,7 @@
                 <w:noProof/>
                 <w:webHidden/>
               </w:rPr>
-              <w:instrText xml:space="preserve"> PAGEREF _Toc202291861 \h </w:instrText>
+              <w:instrText xml:space="preserve"> PAGEREF _Toc202984727 \h </w:instrText>
             </w:r>
             <w:r>
               <w:rPr>
@@ -3406,7 +3406,7 @@
       <w:pPr>
         <w:pStyle w:val="Titulosgenerales"/>
       </w:pPr>
-      <w:bookmarkStart w:id="0" w:name="_Toc202291827"/>
+      <w:bookmarkStart w:id="0" w:name="_Toc202984693"/>
       <w:r>
         <w:lastRenderedPageBreak/>
         <w:t>Introducción</w:t>
@@ -3608,7 +3608,14 @@
                 <w:bCs/>
                 <w:lang w:val="es-419"/>
               </w:rPr>
-              <w:t>generalidades, ingredientes y aspectos higiénicos en la preparación de conservas.</w:t>
+              <w:t>G</w:t>
+            </w:r>
+            <w:r>
+              <w:rPr>
+                <w:bCs/>
+                <w:lang w:val="es-419"/>
+              </w:rPr>
+              <w:t>eneralidades, ingredientes y aspectos higiénicos en la preparación de conservas.</w:t>
             </w:r>
           </w:p>
         </w:tc>
@@ -3808,7 +3815,7 @@
       <w:pPr>
         <w:pStyle w:val="Ttulo1"/>
       </w:pPr>
-      <w:bookmarkStart w:id="1" w:name="_Toc202291828"/>
+      <w:bookmarkStart w:id="1" w:name="_Toc202984694"/>
       <w:r>
         <w:lastRenderedPageBreak/>
         <w:t>Generalidades de las frutas y verduras</w:t>
@@ -3853,9 +3860,9 @@
       <w:pPr>
         <w:pStyle w:val="Ttulo2"/>
       </w:pPr>
-      <w:bookmarkStart w:id="2" w:name="_Toc202291829"/>
-      <w:r>
-        <w:t>Diferencia entre frutas y verduras</w:t>
+      <w:bookmarkStart w:id="2" w:name="_Toc202984695"/>
+      <w:r>
+        <w:t>1.1 Diferencia entre frutas y verduras</w:t>
       </w:r>
       <w:bookmarkEnd w:id="2"/>
     </w:p>
@@ -4121,7 +4128,10 @@
       <w:pPr>
         <w:pStyle w:val="Ttulo2"/>
       </w:pPr>
-      <w:bookmarkStart w:id="3" w:name="_Toc202291830"/>
+      <w:bookmarkStart w:id="3" w:name="_Toc202984696"/>
+      <w:r>
+        <w:t xml:space="preserve">1.2 </w:t>
+      </w:r>
       <w:r>
         <w:t>Clasificación de las frutas</w:t>
       </w:r>
@@ -4213,7 +4223,25 @@
         <w:rPr>
           <w:lang w:val="es-419" w:eastAsia="es-CO"/>
         </w:rPr>
-        <w:t>a, mango entre otros</w:t>
+        <w:t>a, mango</w:t>
+      </w:r>
+      <w:r>
+        <w:rPr>
+          <w:lang w:val="es-419" w:eastAsia="es-CO"/>
+        </w:rPr>
+        <w:t>,</w:t>
+      </w:r>
+      <w:r>
+        <w:rPr>
+          <w:lang w:val="es-419" w:eastAsia="es-CO"/>
+        </w:rPr>
+        <w:t xml:space="preserve"> entre otros</w:t>
+      </w:r>
+      <w:r>
+        <w:rPr>
+          <w:lang w:val="es-419" w:eastAsia="es-CO"/>
+        </w:rPr>
+        <w:t>.</w:t>
       </w:r>
     </w:p>
     <w:p>
@@ -4239,7 +4267,19 @@
         <w:rPr>
           <w:lang w:val="es-419" w:eastAsia="es-CO"/>
         </w:rPr>
-        <w:t xml:space="preserve"> presentan poco o nula cantidad de agua. Ejemplo:  nueces y almendras.</w:t>
+        <w:t xml:space="preserve"> presentan poc</w:t>
+      </w:r>
+      <w:r>
+        <w:rPr>
+          <w:lang w:val="es-419" w:eastAsia="es-CO"/>
+        </w:rPr>
+        <w:t>a</w:t>
+      </w:r>
+      <w:r>
+        <w:rPr>
+          <w:lang w:val="es-419" w:eastAsia="es-CO"/>
+        </w:rPr>
+        <w:t xml:space="preserve"> o nula cantidad de agua. Ejemplo:  nueces y almendras.</w:t>
       </w:r>
     </w:p>
     <w:p>
@@ -4415,7 +4455,10 @@
       <w:pPr>
         <w:pStyle w:val="Ttulo2"/>
       </w:pPr>
-      <w:bookmarkStart w:id="4" w:name="_Toc202291831"/>
+      <w:bookmarkStart w:id="4" w:name="_Toc202984697"/>
+      <w:r>
+        <w:t xml:space="preserve">1.3 </w:t>
+      </w:r>
       <w:r>
         <w:t>Clasificación de las verduras</w:t>
       </w:r>
@@ -4707,7 +4750,19 @@
         <w:rPr>
           <w:lang w:val="es-419" w:eastAsia="es-CO"/>
         </w:rPr>
-        <w:t>Ejemplos: pepino, pimentón, tomate (inmaduro) entre otros,</w:t>
+        <w:t>Ejemplos: pepino, pimentón, tomate (inmaduro)</w:t>
+      </w:r>
+      <w:r>
+        <w:rPr>
+          <w:lang w:val="es-419" w:eastAsia="es-CO"/>
+        </w:rPr>
+        <w:t xml:space="preserve">, </w:t>
+      </w:r>
+      <w:r>
+        <w:rPr>
+          <w:lang w:val="es-419" w:eastAsia="es-CO"/>
+        </w:rPr>
+        <w:t>entre otros,</w:t>
       </w:r>
     </w:p>
     <w:p>
@@ -4754,7 +4809,7 @@
       <w:pPr>
         <w:pStyle w:val="Ttulo1"/>
       </w:pPr>
-      <w:bookmarkStart w:id="5" w:name="_Toc202291832"/>
+      <w:bookmarkStart w:id="5" w:name="_Toc202984698"/>
       <w:r>
         <w:lastRenderedPageBreak/>
         <w:t>Principales componentes de frutas y verduras</w:t>
@@ -4786,7 +4841,7 @@
           <w:numId w:val="6"/>
         </w:numPr>
       </w:pPr>
-      <w:bookmarkStart w:id="6" w:name="_Toc202291833"/>
+      <w:bookmarkStart w:id="6" w:name="_Toc202984699"/>
       <w:r>
         <w:t>Vitaminas y sus funciones</w:t>
       </w:r>
@@ -4835,10 +4890,11 @@
       </w:pPr>
       <w:r>
         <w:rPr>
+          <w:noProof/>
           <w:lang w:val="es-419" w:eastAsia="es-CO"/>
         </w:rPr>
         <w:drawing>
-          <wp:anchor distT="0" distB="0" distL="114300" distR="114300" simplePos="0" relativeHeight="251664384" behindDoc="0" locked="0" layoutInCell="1" allowOverlap="1" wp14:anchorId="7B0AD71D" wp14:editId="4B8BEA01">
+          <wp:anchor distT="0" distB="0" distL="114300" distR="114300" simplePos="0" relativeHeight="251664384" behindDoc="0" locked="0" layoutInCell="1" allowOverlap="1" wp14:anchorId="7B0AD71D" wp14:editId="433D660B">
             <wp:simplePos x="0" y="0"/>
             <wp:positionH relativeFrom="column">
               <wp:posOffset>1744972</wp:posOffset>
@@ -4849,7 +4905,7 @@
             <wp:extent cx="2787015" cy="2800985"/>
             <wp:effectExtent l="0" t="0" r="0" b="5715"/>
             <wp:wrapSquare wrapText="bothSides"/>
-            <wp:docPr id="1932775691" name="Imagen 1" descr="En la figura 1, se ilustran las diferentes vitaminas que poseen las frutas: vitamina A, C, D, E, K, B1, B2, B3, B6, B7., B9., B12."/>
+            <wp:docPr id="1932775691" name="Imagen 1" descr="En la imagen se detallan las 12 vitaminas principales A, C, D, E, K, B1, B2, B3, B6, B7, B9, B12."/>
             <wp:cNvGraphicFramePr>
               <a:graphicFrameLocks xmlns:a="http://schemas.openxmlformats.org/drawingml/2006/main" noChangeAspect="1"/>
             </wp:cNvGraphicFramePr>
@@ -4857,7 +4913,7 @@
               <a:graphicData uri="http://schemas.openxmlformats.org/drawingml/2006/picture">
                 <pic:pic xmlns:pic="http://schemas.openxmlformats.org/drawingml/2006/picture">
                   <pic:nvPicPr>
-                    <pic:cNvPr id="1932775691" name="Imagen 1" descr="En la figura 1, se ilustran las diferentes vitaminas que poseen las frutas: vitamina A, C, D, E, K, B1, B2, B3, B6, B7., B9., B12."/>
+                    <pic:cNvPr id="1932775691" name="Imagen 1" descr="En la imagen se detallan las 12 vitaminas principales A, C, D, E, K, B1, B2, B3, B6, B7, B9, B12."/>
                     <pic:cNvPicPr/>
                   </pic:nvPicPr>
                   <pic:blipFill>
@@ -4988,47 +5044,7 @@
           <w:szCs w:val="28"/>
           <w:lang w:val="es-419" w:eastAsia="es-CO"/>
         </w:rPr>
-        <w:t xml:space="preserve"> ilustran</w:t>
-      </w:r>
-      <w:r>
-        <w:rPr>
-          <w:noProof/>
-          <w:szCs w:val="28"/>
-          <w:lang w:val="es-419" w:eastAsia="es-CO"/>
-        </w:rPr>
-        <w:t xml:space="preserve"> </w:t>
-      </w:r>
-      <w:r>
-        <w:rPr>
-          <w:noProof/>
-          <w:szCs w:val="28"/>
-          <w:lang w:val="es-419" w:eastAsia="es-CO"/>
-        </w:rPr>
-        <w:t>las 12 vitaminas principales</w:t>
-      </w:r>
-      <w:r>
-        <w:rPr>
-          <w:noProof/>
-          <w:szCs w:val="28"/>
-          <w:lang w:val="es-419" w:eastAsia="es-CO"/>
-        </w:rPr>
-        <w:t xml:space="preserve"> </w:t>
-      </w:r>
-      <w:r>
-        <w:rPr>
-          <w:noProof/>
-          <w:szCs w:val="28"/>
-          <w:lang w:val="es-419" w:eastAsia="es-CO"/>
-        </w:rPr>
-        <w:t>presentes</w:t>
-      </w:r>
-      <w:r>
-        <w:rPr>
-          <w:noProof/>
-          <w:szCs w:val="28"/>
-          <w:lang w:val="es-419" w:eastAsia="es-CO"/>
-        </w:rPr>
-        <w:t xml:space="preserve"> las frutas: vitamina A, C, D, E, K, B1, B2, B3, B6, B7, B9</w:t>
+        <w:t xml:space="preserve"> ilustran las 12 vitaminas principales presentes las frutas: vitamina A, C, D, E, K, B1, B2, B3, B6, B7, B9</w:t>
       </w:r>
       <w:r>
         <w:rPr>
@@ -5128,17 +5144,7 @@
           <w:szCs w:val="28"/>
           <w:lang w:val="es-419"/>
         </w:rPr>
-        <w:t>Vitamina C (ácido ascórbico)</w:t>
-      </w:r>
-      <w:r>
-        <w:rPr>
-          <w:rFonts w:ascii="Calibri" w:hAnsi="Calibri" w:cs="Calibri"/>
-          <w:b/>
-          <w:bCs/>
-          <w:szCs w:val="28"/>
-          <w:lang w:val="es-419"/>
-        </w:rPr>
-        <w:t>:</w:t>
+        <w:t>Vitamina C (ácido ascórbico):</w:t>
       </w:r>
       <w:r>
         <w:rPr>
@@ -5146,15 +5152,7 @@
           <w:szCs w:val="28"/>
           <w:lang w:val="es-419"/>
         </w:rPr>
-        <w:t xml:space="preserve"> a</w:t>
-      </w:r>
-      <w:r>
-        <w:rPr>
-          <w:rFonts w:ascii="Calibri" w:hAnsi="Calibri" w:cs="Calibri"/>
-          <w:szCs w:val="28"/>
-          <w:lang w:val="es-419"/>
-        </w:rPr>
-        <w:t>ntioxidante, favorece la absorción de hierro y fortalece el sistema inmunológico. Presente en cítricos, guayaba, pimientos, entre otros.</w:t>
+        <w:t xml:space="preserve"> antioxidante, favorece la absorción de hierro y fortalece el sistema inmunológico. Presente en cítricos, guayaba, pimientos, entre otros.</w:t>
       </w:r>
     </w:p>
     <w:p>
@@ -5178,17 +5176,7 @@
           <w:szCs w:val="28"/>
           <w:lang w:val="es-419"/>
         </w:rPr>
-        <w:t>Vitamina A (en forma de betacarotenos)</w:t>
-      </w:r>
-      <w:r>
-        <w:rPr>
-          <w:rFonts w:ascii="Calibri" w:hAnsi="Calibri" w:cs="Calibri"/>
-          <w:b/>
-          <w:bCs/>
-          <w:szCs w:val="28"/>
-          <w:lang w:val="es-419"/>
-        </w:rPr>
-        <w:t>:</w:t>
+        <w:t>Vitamina A (en forma de betacarotenos):</w:t>
       </w:r>
       <w:r>
         <w:rPr>
@@ -5196,15 +5184,7 @@
           <w:szCs w:val="28"/>
           <w:lang w:val="es-419"/>
         </w:rPr>
-        <w:t xml:space="preserve"> e</w:t>
-      </w:r>
-      <w:r>
-        <w:rPr>
-          <w:rFonts w:ascii="Calibri" w:hAnsi="Calibri" w:cs="Calibri"/>
-          <w:szCs w:val="28"/>
-          <w:lang w:val="es-419"/>
-        </w:rPr>
-        <w:t>sencial para la visión, el crecimiento y la piel. Abundante en zanahoria, calabaza y mango.</w:t>
+        <w:t xml:space="preserve"> esencial para la visión, el crecimiento y la piel. Abundante en zanahoria, calabaza y mango.</w:t>
       </w:r>
     </w:p>
     <w:p>
@@ -5228,17 +5208,7 @@
           <w:szCs w:val="28"/>
           <w:lang w:val="es-419"/>
         </w:rPr>
-        <w:t>Vitamina K</w:t>
-      </w:r>
-      <w:r>
-        <w:rPr>
-          <w:rFonts w:ascii="Calibri" w:hAnsi="Calibri" w:cs="Calibri"/>
-          <w:b/>
-          <w:bCs/>
-          <w:szCs w:val="28"/>
-          <w:lang w:val="es-419"/>
-        </w:rPr>
-        <w:t xml:space="preserve">: </w:t>
+        <w:t xml:space="preserve">Vitamina K: </w:t>
       </w:r>
       <w:r>
         <w:rPr>
@@ -5246,15 +5216,7 @@
           <w:szCs w:val="28"/>
           <w:lang w:val="es-419"/>
         </w:rPr>
-        <w:t>i</w:t>
-      </w:r>
-      <w:r>
-        <w:rPr>
-          <w:rFonts w:ascii="Calibri" w:hAnsi="Calibri" w:cs="Calibri"/>
-          <w:szCs w:val="28"/>
-          <w:lang w:val="es-419"/>
-        </w:rPr>
-        <w:t>mportante en la coagulación sanguínea. Presente en vegetales de hojas verdes.</w:t>
+        <w:t>importante en la coagulación sanguínea. Presente en vegetales de hojas verdes.</w:t>
       </w:r>
     </w:p>
     <w:p>
@@ -5278,17 +5240,7 @@
           <w:szCs w:val="28"/>
           <w:lang w:val="es-419"/>
         </w:rPr>
-        <w:t>Vitaminas del complejo B</w:t>
-      </w:r>
-      <w:r>
-        <w:rPr>
-          <w:rFonts w:ascii="Calibri" w:hAnsi="Calibri" w:cs="Calibri"/>
-          <w:b/>
-          <w:bCs/>
-          <w:szCs w:val="28"/>
-          <w:lang w:val="es-419"/>
-        </w:rPr>
-        <w:t>:</w:t>
+        <w:t>Vitaminas del complejo B:</w:t>
       </w:r>
       <w:r>
         <w:rPr>
@@ -5296,15 +5248,7 @@
           <w:szCs w:val="28"/>
           <w:lang w:val="es-419"/>
         </w:rPr>
-        <w:t xml:space="preserve"> i</w:t>
-      </w:r>
-      <w:r>
-        <w:rPr>
-          <w:rFonts w:ascii="Calibri" w:hAnsi="Calibri" w:cs="Calibri"/>
-          <w:szCs w:val="28"/>
-          <w:lang w:val="es-419"/>
-        </w:rPr>
-        <w:t>ntervienen en el metabolismo energético. Se encuentran en plátanos, aguacates y legumbres.</w:t>
+        <w:t xml:space="preserve"> intervienen en el metabolismo energético. Se encuentran en plátanos, aguacates y legumbres.</w:t>
       </w:r>
     </w:p>
     <w:p>
@@ -5315,7 +5259,7 @@
           <w:numId w:val="6"/>
         </w:numPr>
       </w:pPr>
-      <w:bookmarkStart w:id="7" w:name="_Toc202291834"/>
+      <w:bookmarkStart w:id="7" w:name="_Toc202984700"/>
       <w:r>
         <w:t>Minerales e</w:t>
       </w:r>
@@ -5397,9 +5341,17 @@
       </w:pPr>
       <w:r>
         <w:rPr>
-          <w:lang w:val="es-419" w:eastAsia="es-CO"/>
-        </w:rPr>
-        <w:t>Función: funcionamiento de músculos, huesos y dientes, ayuda en articulaciones.</w:t>
+          <w:b/>
+          <w:bCs/>
+          <w:lang w:val="es-419" w:eastAsia="es-CO"/>
+        </w:rPr>
+        <w:t xml:space="preserve">Función: </w:t>
+      </w:r>
+      <w:r>
+        <w:rPr>
+          <w:lang w:val="es-419" w:eastAsia="es-CO"/>
+        </w:rPr>
+        <w:t>funcionamiento de músculos, huesos y dientes, ayuda en articulaciones.</w:t>
       </w:r>
     </w:p>
     <w:p>
@@ -5416,9 +5368,17 @@
       </w:pPr>
       <w:r>
         <w:rPr>
-          <w:lang w:val="es-419" w:eastAsia="es-CO"/>
-        </w:rPr>
-        <w:t>Procedencia: trigo, fríjoles, maíz, avena, almendras, nueces, higos, verduras de hojas verdes, entre otras.</w:t>
+          <w:b/>
+          <w:bCs/>
+          <w:lang w:val="es-419" w:eastAsia="es-CO"/>
+        </w:rPr>
+        <w:t>Procedencia:</w:t>
+      </w:r>
+      <w:r>
+        <w:rPr>
+          <w:lang w:val="es-419" w:eastAsia="es-CO"/>
+        </w:rPr>
+        <w:t xml:space="preserve"> trigo, fríjoles, maíz, avena, almendras, nueces, higos, verduras de hojas verdes, entre otras.</w:t>
       </w:r>
     </w:p>
     <w:p>
@@ -5466,9 +5426,17 @@
       </w:pPr>
       <w:r>
         <w:rPr>
-          <w:lang w:val="es-419" w:eastAsia="es-CO"/>
-        </w:rPr>
-        <w:t>Función: formación de huesos y dientes, coagulación sanguínea, funciones musculares.</w:t>
+          <w:b/>
+          <w:bCs/>
+          <w:lang w:val="es-419" w:eastAsia="es-CO"/>
+        </w:rPr>
+        <w:t>Función:</w:t>
+      </w:r>
+      <w:r>
+        <w:rPr>
+          <w:lang w:val="es-419" w:eastAsia="es-CO"/>
+        </w:rPr>
+        <w:t xml:space="preserve"> formación de huesos y dientes, coagulación sanguínea, funciones musculares.</w:t>
       </w:r>
     </w:p>
     <w:p>
@@ -5485,9 +5453,29 @@
       </w:pPr>
       <w:r>
         <w:rPr>
-          <w:lang w:val="es-419" w:eastAsia="es-CO"/>
-        </w:rPr>
-        <w:t>Procedencia: verduras de hojas verdes, semillas de ajonjolí, perejil entre otras.</w:t>
+          <w:b/>
+          <w:bCs/>
+          <w:lang w:val="es-419" w:eastAsia="es-CO"/>
+        </w:rPr>
+        <w:t>Procedencia:</w:t>
+      </w:r>
+      <w:r>
+        <w:rPr>
+          <w:lang w:val="es-419" w:eastAsia="es-CO"/>
+        </w:rPr>
+        <w:t xml:space="preserve"> verduras de hojas verdes, semillas de ajonjolí, perejil</w:t>
+      </w:r>
+      <w:r>
+        <w:rPr>
+          <w:lang w:val="es-419" w:eastAsia="es-CO"/>
+        </w:rPr>
+        <w:t>,</w:t>
+      </w:r>
+      <w:r>
+        <w:rPr>
+          <w:lang w:val="es-419" w:eastAsia="es-CO"/>
+        </w:rPr>
+        <w:t xml:space="preserve"> entre otras.</w:t>
       </w:r>
     </w:p>
     <w:p>
@@ -5535,9 +5523,17 @@
       </w:pPr>
       <w:r>
         <w:rPr>
-          <w:lang w:val="es-419" w:eastAsia="es-CO"/>
-        </w:rPr>
-        <w:t>Función: producción de hemoglobina y transporte de oxígeno.</w:t>
+          <w:b/>
+          <w:bCs/>
+          <w:lang w:val="es-419" w:eastAsia="es-CO"/>
+        </w:rPr>
+        <w:t>Función:</w:t>
+      </w:r>
+      <w:r>
+        <w:rPr>
+          <w:lang w:val="es-419" w:eastAsia="es-CO"/>
+        </w:rPr>
+        <w:t xml:space="preserve"> producción de hemoglobina y transporte de oxígeno.</w:t>
       </w:r>
     </w:p>
     <w:p>
@@ -5554,9 +5550,17 @@
       </w:pPr>
       <w:r>
         <w:rPr>
-          <w:lang w:val="es-419" w:eastAsia="es-CO"/>
-        </w:rPr>
-        <w:t>Procedencia: verduras de hojas verdes, higos, entre otras.</w:t>
+          <w:b/>
+          <w:bCs/>
+          <w:lang w:val="es-419" w:eastAsia="es-CO"/>
+        </w:rPr>
+        <w:t>Procedencia:</w:t>
+      </w:r>
+      <w:r>
+        <w:rPr>
+          <w:lang w:val="es-419" w:eastAsia="es-CO"/>
+        </w:rPr>
+        <w:t xml:space="preserve"> verduras de hojas verdes, higos, entre otras.</w:t>
       </w:r>
     </w:p>
     <w:p>
@@ -5604,9 +5608,17 @@
       </w:pPr>
       <w:r>
         <w:rPr>
-          <w:lang w:val="es-419" w:eastAsia="es-CO"/>
-        </w:rPr>
-        <w:t>Función: formación de huesos y dientes, creación de células.</w:t>
+          <w:b/>
+          <w:bCs/>
+          <w:lang w:val="es-419" w:eastAsia="es-CO"/>
+        </w:rPr>
+        <w:t>Función:</w:t>
+      </w:r>
+      <w:r>
+        <w:rPr>
+          <w:lang w:val="es-419" w:eastAsia="es-CO"/>
+        </w:rPr>
+        <w:t xml:space="preserve"> formación de huesos y dientes, creación de células.</w:t>
       </w:r>
     </w:p>
     <w:p>
@@ -5623,9 +5635,17 @@
       </w:pPr>
       <w:r>
         <w:rPr>
-          <w:lang w:val="es-419" w:eastAsia="es-CO"/>
-        </w:rPr>
-        <w:t>Procedencia: cereales naturales, frijoles, lentejas, entre otras.</w:t>
+          <w:b/>
+          <w:bCs/>
+          <w:lang w:val="es-419" w:eastAsia="es-CO"/>
+        </w:rPr>
+        <w:t>Procedencia:</w:t>
+      </w:r>
+      <w:r>
+        <w:rPr>
+          <w:lang w:val="es-419" w:eastAsia="es-CO"/>
+        </w:rPr>
+        <w:t xml:space="preserve"> cereales naturales, frijoles, lentejas, entre otras.</w:t>
       </w:r>
     </w:p>
     <w:p>
@@ -5673,9 +5693,17 @@
       </w:pPr>
       <w:r>
         <w:rPr>
-          <w:lang w:val="es-419" w:eastAsia="es-CO"/>
-        </w:rPr>
-        <w:t>Función: propiedades antioxidantes, prevención del cáncer, apoyo al corazón, hígado y órganos reproductivos.</w:t>
+          <w:b/>
+          <w:bCs/>
+          <w:lang w:val="es-419" w:eastAsia="es-CO"/>
+        </w:rPr>
+        <w:t>Función:</w:t>
+      </w:r>
+      <w:r>
+        <w:rPr>
+          <w:lang w:val="es-419" w:eastAsia="es-CO"/>
+        </w:rPr>
+        <w:t xml:space="preserve"> propiedades antioxidantes, prevención del cáncer, apoyo al corazón, hígado y órganos reproductivos.</w:t>
       </w:r>
     </w:p>
     <w:p>
@@ -5692,9 +5720,17 @@
       </w:pPr>
       <w:r>
         <w:rPr>
-          <w:lang w:val="es-419" w:eastAsia="es-CO"/>
-        </w:rPr>
-        <w:t>Procedencia: cereales integrales, verduras, entre otras.</w:t>
+          <w:b/>
+          <w:bCs/>
+          <w:lang w:val="es-419" w:eastAsia="es-CO"/>
+        </w:rPr>
+        <w:t>Procedencia:</w:t>
+      </w:r>
+      <w:r>
+        <w:rPr>
+          <w:lang w:val="es-419" w:eastAsia="es-CO"/>
+        </w:rPr>
+        <w:t xml:space="preserve"> cereales integrales, verduras, entre otras.</w:t>
       </w:r>
     </w:p>
     <w:p>
@@ -5761,9 +5797,17 @@
       </w:pPr>
       <w:r>
         <w:rPr>
-          <w:lang w:val="es-419" w:eastAsia="es-CO"/>
-        </w:rPr>
-        <w:t>Función: funcionamiento de riñones y corazón, transmisión de señales nerviosas, control de niveles de agua.</w:t>
+          <w:b/>
+          <w:bCs/>
+          <w:lang w:val="es-419" w:eastAsia="es-CO"/>
+        </w:rPr>
+        <w:t>Función:</w:t>
+      </w:r>
+      <w:r>
+        <w:rPr>
+          <w:lang w:val="es-419" w:eastAsia="es-CO"/>
+        </w:rPr>
+        <w:t xml:space="preserve"> funcionamiento de riñones y corazón, transmisión de señales nerviosas, control de niveles de agua.</w:t>
       </w:r>
     </w:p>
     <w:p>
@@ -5780,9 +5824,29 @@
       </w:pPr>
       <w:r>
         <w:rPr>
-          <w:lang w:val="es-419" w:eastAsia="es-CO"/>
-        </w:rPr>
-        <w:t>Procedencia: frutas, vegetales de hojas verdes, papas entre otras.</w:t>
+          <w:b/>
+          <w:bCs/>
+          <w:lang w:val="es-419" w:eastAsia="es-CO"/>
+        </w:rPr>
+        <w:t>Procedencia:</w:t>
+      </w:r>
+      <w:r>
+        <w:rPr>
+          <w:lang w:val="es-419" w:eastAsia="es-CO"/>
+        </w:rPr>
+        <w:t xml:space="preserve"> frutas, vegetales de hojas verdes, papas</w:t>
+      </w:r>
+      <w:r>
+        <w:rPr>
+          <w:lang w:val="es-419" w:eastAsia="es-CO"/>
+        </w:rPr>
+        <w:t>,</w:t>
+      </w:r>
+      <w:r>
+        <w:rPr>
+          <w:lang w:val="es-419" w:eastAsia="es-CO"/>
+        </w:rPr>
+        <w:t xml:space="preserve"> entre otras.</w:t>
       </w:r>
     </w:p>
     <w:p>
@@ -5830,9 +5894,17 @@
       </w:pPr>
       <w:r>
         <w:rPr>
-          <w:lang w:val="es-419" w:eastAsia="es-CO"/>
-        </w:rPr>
-        <w:t>Función: funcionamiento de músculos y nervios, regulación de líquidos y digestión.</w:t>
+          <w:b/>
+          <w:bCs/>
+          <w:lang w:val="es-419" w:eastAsia="es-CO"/>
+        </w:rPr>
+        <w:t xml:space="preserve">Función: </w:t>
+      </w:r>
+      <w:r>
+        <w:rPr>
+          <w:lang w:val="es-419" w:eastAsia="es-CO"/>
+        </w:rPr>
+        <w:t>funcionamiento de músculos y nervios, regulación de líquidos y digestión.</w:t>
       </w:r>
     </w:p>
     <w:p>
@@ -5849,9 +5921,17 @@
       </w:pPr>
       <w:r>
         <w:rPr>
-          <w:lang w:val="es-419" w:eastAsia="es-CO"/>
-        </w:rPr>
-        <w:t>Procedencia: cereales.</w:t>
+          <w:b/>
+          <w:bCs/>
+          <w:lang w:val="es-419" w:eastAsia="es-CO"/>
+        </w:rPr>
+        <w:t>Procedencia:</w:t>
+      </w:r>
+      <w:r>
+        <w:rPr>
+          <w:lang w:val="es-419" w:eastAsia="es-CO"/>
+        </w:rPr>
+        <w:t xml:space="preserve"> cereales.</w:t>
       </w:r>
     </w:p>
     <w:p>
@@ -5899,9 +5979,17 @@
       </w:pPr>
       <w:r>
         <w:rPr>
-          <w:lang w:val="es-419" w:eastAsia="es-CO"/>
-        </w:rPr>
-        <w:t>Función: composición de huesos y dientes, previene caries dentales.</w:t>
+          <w:b/>
+          <w:bCs/>
+          <w:lang w:val="es-419" w:eastAsia="es-CO"/>
+        </w:rPr>
+        <w:t>Función:</w:t>
+      </w:r>
+      <w:r>
+        <w:rPr>
+          <w:lang w:val="es-419" w:eastAsia="es-CO"/>
+        </w:rPr>
+        <w:t xml:space="preserve"> composición de huesos y dientes, previene caries dentales.</w:t>
       </w:r>
     </w:p>
     <w:p>
@@ -5918,9 +6006,17 @@
       </w:pPr>
       <w:r>
         <w:rPr>
-          <w:lang w:val="es-419" w:eastAsia="es-CO"/>
-        </w:rPr>
-        <w:t>Procedencia: frutas y verduras.</w:t>
+          <w:b/>
+          <w:bCs/>
+          <w:lang w:val="es-419" w:eastAsia="es-CO"/>
+        </w:rPr>
+        <w:t>Procedencia:</w:t>
+      </w:r>
+      <w:r>
+        <w:rPr>
+          <w:lang w:val="es-419" w:eastAsia="es-CO"/>
+        </w:rPr>
+        <w:t xml:space="preserve"> frutas y verduras.</w:t>
       </w:r>
     </w:p>
     <w:p>
@@ -5968,9 +6064,17 @@
       </w:pPr>
       <w:r>
         <w:rPr>
-          <w:lang w:val="es-419" w:eastAsia="es-CO"/>
-        </w:rPr>
-        <w:t>Función: desarrollo del cuerpo, piel y cabello.</w:t>
+          <w:b/>
+          <w:bCs/>
+          <w:lang w:val="es-419" w:eastAsia="es-CO"/>
+        </w:rPr>
+        <w:t>Función:</w:t>
+      </w:r>
+      <w:r>
+        <w:rPr>
+          <w:lang w:val="es-419" w:eastAsia="es-CO"/>
+        </w:rPr>
+        <w:t xml:space="preserve"> desarrollo del cuerpo, piel y cabello.</w:t>
       </w:r>
     </w:p>
     <w:p>
@@ -5987,9 +6091,17 @@
       </w:pPr>
       <w:r>
         <w:rPr>
-          <w:lang w:val="es-419" w:eastAsia="es-CO"/>
-        </w:rPr>
-        <w:t>Procedencia: legumbres, frutos secos, semillas de girasol, entre otras.</w:t>
+          <w:b/>
+          <w:bCs/>
+          <w:lang w:val="es-419" w:eastAsia="es-CO"/>
+        </w:rPr>
+        <w:t>Procedencia:</w:t>
+      </w:r>
+      <w:r>
+        <w:rPr>
+          <w:lang w:val="es-419" w:eastAsia="es-CO"/>
+        </w:rPr>
+        <w:t xml:space="preserve"> legumbres, frutos secos, semillas de girasol, entre otras.</w:t>
       </w:r>
     </w:p>
     <w:p>
@@ -6003,7 +6115,7 @@
           <w:noProof/>
         </w:rPr>
       </w:pPr>
-      <w:bookmarkStart w:id="8" w:name="_Toc202291835"/>
+      <w:bookmarkStart w:id="8" w:name="_Toc202984701"/>
       <w:r>
         <w:rPr>
           <w:noProof/>
@@ -6058,27 +6170,13 @@
           <w:lang w:val="es-419" w:eastAsia="es-CO"/>
         </w:rPr>
         <w:lastRenderedPageBreak/>
-        <w:t>Polifenoles</w:t>
-      </w:r>
-      <w:r>
-        <w:rPr>
-          <w:b/>
-          <w:bCs/>
-          <w:lang w:val="es-419" w:eastAsia="es-CO"/>
-        </w:rPr>
-        <w:t xml:space="preserve">: </w:t>
-      </w:r>
-      <w:r>
-        <w:rPr>
-          <w:lang w:val="es-419" w:eastAsia="es-CO"/>
-        </w:rPr>
-        <w:t>s</w:t>
-      </w:r>
-      <w:r>
-        <w:rPr>
-          <w:lang w:val="es-419" w:eastAsia="es-CO"/>
-        </w:rPr>
-        <w:t>on potentes antioxidantes que ayudan a combatir el estrés oxidativo. Se han relacionado con la prevención de enfermedades cardiovasculares y neurodegenerativas.</w:t>
+        <w:t xml:space="preserve">Polifenoles: </w:t>
+      </w:r>
+      <w:r>
+        <w:rPr>
+          <w:lang w:val="es-419" w:eastAsia="es-CO"/>
+        </w:rPr>
+        <w:t>son potentes antioxidantes que ayudan a combatir el estrés oxidativo. Se han relacionado con la prevención de enfermedades cardiovasculares y neurodegenerativas.</w:t>
       </w:r>
     </w:p>
     <w:p>
@@ -6100,27 +6198,13 @@
           <w:bCs/>
           <w:lang w:val="es-419" w:eastAsia="es-CO"/>
         </w:rPr>
-        <w:t>Flavonoides</w:t>
-      </w:r>
-      <w:r>
-        <w:rPr>
-          <w:b/>
-          <w:bCs/>
-          <w:lang w:val="es-419" w:eastAsia="es-CO"/>
-        </w:rPr>
-        <w:t xml:space="preserve">: </w:t>
-      </w:r>
-      <w:r>
-        <w:rPr>
-          <w:lang w:val="es-419" w:eastAsia="es-CO"/>
-        </w:rPr>
-        <w:t>son un</w:t>
-      </w:r>
-      <w:r>
-        <w:rPr>
-          <w:lang w:val="es-419" w:eastAsia="es-CO"/>
-        </w:rPr>
-        <w:t xml:space="preserve"> de polifenol presente en frutas cítricas, cebolla y otros vegetales. Poseen propiedades antiinflamatorias y protectoras del sistema inmunológico.</w:t>
+        <w:t xml:space="preserve">Flavonoides: </w:t>
+      </w:r>
+      <w:r>
+        <w:rPr>
+          <w:lang w:val="es-419" w:eastAsia="es-CO"/>
+        </w:rPr>
+        <w:t xml:space="preserve">son un tipo de polifenol presente en frutas cítricas, cebolla y otros vegetales. </w:t>
       </w:r>
     </w:p>
     <w:p>
@@ -6142,27 +6226,13 @@
           <w:bCs/>
           <w:lang w:val="es-419" w:eastAsia="es-CO"/>
         </w:rPr>
-        <w:t>Glucosinolatos</w:t>
-      </w:r>
-      <w:r>
-        <w:rPr>
-          <w:b/>
-          <w:bCs/>
-          <w:lang w:val="es-419" w:eastAsia="es-CO"/>
-        </w:rPr>
-        <w:t>:</w:t>
-      </w:r>
-      <w:r>
-        <w:rPr>
-          <w:lang w:val="es-419" w:eastAsia="es-CO"/>
-        </w:rPr>
-        <w:t xml:space="preserve"> a</w:t>
-      </w:r>
-      <w:r>
-        <w:rPr>
-          <w:lang w:val="es-419" w:eastAsia="es-CO"/>
-        </w:rPr>
-        <w:t>bundantes en vegetales como el brócoli, la col y la coliflor. Estos compuestos tienen potencial anticancerígeno y favorecen la desintoxicación del organismo.</w:t>
+        <w:t>Glucosinolatos:</w:t>
+      </w:r>
+      <w:r>
+        <w:rPr>
+          <w:lang w:val="es-419" w:eastAsia="es-CO"/>
+        </w:rPr>
+        <w:t xml:space="preserve"> abundantes en vegetales como el brócoli, la col y la coliflor. Estos compuestos tienen potencial anticancerígeno y favorecen la desintoxicación del organismo.</w:t>
       </w:r>
     </w:p>
     <w:p>
@@ -6330,6 +6400,14 @@
     <w:p>
       <w:pPr>
         <w:rPr>
+          <w:szCs w:val="28"/>
+          <w:lang w:val="es-419" w:eastAsia="es-CO"/>
+        </w:rPr>
+      </w:pPr>
+    </w:p>
+    <w:p>
+      <w:pPr>
+        <w:rPr>
           <w:b/>
           <w:bCs/>
           <w:szCs w:val="28"/>
@@ -6762,19 +6840,28 @@
     <w:p>
       <w:pPr>
         <w:rPr>
-          <w:b/>
-          <w:bCs/>
           <w:szCs w:val="28"/>
           <w:lang w:val="es-419" w:eastAsia="es-CO"/>
         </w:rPr>
       </w:pPr>
-      <w:r>
+    </w:p>
+    <w:p>
+      <w:pPr>
         <w:rPr>
           <w:b/>
           <w:bCs/>
           <w:szCs w:val="28"/>
           <w:lang w:val="es-419" w:eastAsia="es-CO"/>
         </w:rPr>
+      </w:pPr>
+      <w:r>
+        <w:rPr>
+          <w:b/>
+          <w:bCs/>
+          <w:szCs w:val="28"/>
+          <w:lang w:val="es-419" w:eastAsia="es-CO"/>
+        </w:rPr>
+        <w:lastRenderedPageBreak/>
         <w:t xml:space="preserve">Ejemplos: </w:t>
       </w:r>
     </w:p>
@@ -6795,7 +6882,6 @@
           <w:szCs w:val="28"/>
           <w:lang w:val="es-419" w:eastAsia="es-CO"/>
         </w:rPr>
-        <w:lastRenderedPageBreak/>
         <w:t>Tioles: presentes en cebolla, ajo, repollo y brócoli.</w:t>
       </w:r>
     </w:p>
@@ -6816,7 +6902,21 @@
           <w:szCs w:val="28"/>
           <w:lang w:val="es-419" w:eastAsia="es-CO"/>
         </w:rPr>
-        <w:t>Lignanos: en trigo integral, cebada, linaza entre otros.</w:t>
+        <w:t>Lignanos: en trigo integral, cebada, linaza</w:t>
+      </w:r>
+      <w:r>
+        <w:rPr>
+          <w:szCs w:val="28"/>
+          <w:lang w:val="es-419" w:eastAsia="es-CO"/>
+        </w:rPr>
+        <w:t>,</w:t>
+      </w:r>
+      <w:r>
+        <w:rPr>
+          <w:szCs w:val="28"/>
+          <w:lang w:val="es-419" w:eastAsia="es-CO"/>
+        </w:rPr>
+        <w:t xml:space="preserve"> entre otros.</w:t>
       </w:r>
     </w:p>
     <w:p>
@@ -6921,7 +7021,7 @@
           <w:numId w:val="6"/>
         </w:numPr>
       </w:pPr>
-      <w:bookmarkStart w:id="9" w:name="_Toc202291836"/>
+      <w:bookmarkStart w:id="9" w:name="_Toc202984702"/>
       <w:r>
         <w:t>Esteroles vegetales</w:t>
       </w:r>
@@ -6987,7 +7087,7 @@
           <w:numId w:val="6"/>
         </w:numPr>
       </w:pPr>
-      <w:bookmarkStart w:id="10" w:name="_Toc202291837"/>
+      <w:bookmarkStart w:id="10" w:name="_Toc202984703"/>
       <w:r>
         <w:t>Pigmentos naturales</w:t>
       </w:r>
@@ -7138,7 +7238,7 @@
       <w:pPr>
         <w:pStyle w:val="Ttulo1"/>
       </w:pPr>
-      <w:bookmarkStart w:id="11" w:name="_Toc202291838"/>
+      <w:bookmarkStart w:id="11" w:name="_Toc202984704"/>
       <w:r>
         <w:lastRenderedPageBreak/>
         <w:t>Cambios fisiológicos y mecanismos de alteración</w:t>
@@ -7172,7 +7272,7 @@
           <w:numId w:val="6"/>
         </w:numPr>
       </w:pPr>
-      <w:bookmarkStart w:id="12" w:name="_Toc202291839"/>
+      <w:bookmarkStart w:id="12" w:name="_Toc202984705"/>
       <w:r>
         <w:t>Cambios fisiológicos y metabólicos poscosecha</w:t>
       </w:r>
@@ -7210,27 +7310,13 @@
           <w:bCs/>
           <w:lang w:val="es-419" w:eastAsia="es-CO"/>
         </w:rPr>
-        <w:t>Transpiración</w:t>
-      </w:r>
-      <w:r>
-        <w:rPr>
-          <w:b/>
-          <w:bCs/>
-          <w:lang w:val="es-419" w:eastAsia="es-CO"/>
-        </w:rPr>
-        <w:t xml:space="preserve">: </w:t>
-      </w:r>
-      <w:r>
-        <w:rPr>
-          <w:lang w:val="es-419" w:eastAsia="es-CO"/>
-        </w:rPr>
-        <w:t>e</w:t>
-      </w:r>
-      <w:r>
-        <w:rPr>
-          <w:lang w:val="es-419" w:eastAsia="es-CO"/>
-        </w:rPr>
-        <w:t>s el proceso mediante el cual los vegetales pierden agua a través de sus tejidos, especialmente por la superficie de hojas, tallos o cáscaras. Esta pérdida de humedad provoca una disminución del peso, flacidez en los tejidos y eventualmente marchitamiento. La transpiración es más intensa en ambientes cálidos, secos o con mucho movimiento de aire.</w:t>
+        <w:t xml:space="preserve">Transpiración: </w:t>
+      </w:r>
+      <w:r>
+        <w:rPr>
+          <w:lang w:val="es-419" w:eastAsia="es-CO"/>
+        </w:rPr>
+        <w:t>es el proceso mediante el cual los vegetales pierden agua a través de sus tejidos, especialmente por la superficie de hojas, tallos o cáscaras. Esta pérdida de humedad provoca una disminución del peso, flacidez en los tejidos y eventualmente marchitamiento. La transpiración es más intensa en ambientes cálidos, secos o con mucho movimiento de aire.</w:t>
       </w:r>
     </w:p>
     <w:p>
@@ -7252,15 +7338,7 @@
           <w:bCs/>
           <w:lang w:val="es-419" w:eastAsia="es-CO"/>
         </w:rPr>
-        <w:t>Producción de etileno</w:t>
-      </w:r>
-      <w:r>
-        <w:rPr>
-          <w:b/>
-          <w:bCs/>
-          <w:lang w:val="es-419" w:eastAsia="es-CO"/>
-        </w:rPr>
-        <w:t>:</w:t>
+        <w:t>Producción de etileno:</w:t>
       </w:r>
       <w:r>
         <w:rPr>
@@ -7294,15 +7372,7 @@
           <w:bCs/>
           <w:lang w:val="es-419" w:eastAsia="es-CO"/>
         </w:rPr>
-        <w:t>Conversión de almidón en azúcares</w:t>
-      </w:r>
-      <w:r>
-        <w:rPr>
-          <w:b/>
-          <w:bCs/>
-          <w:lang w:val="es-419" w:eastAsia="es-CO"/>
-        </w:rPr>
-        <w:t>:</w:t>
+        <w:t>Conversión de almidón en azúcares:</w:t>
       </w:r>
       <w:r>
         <w:rPr>
@@ -7325,7 +7395,7 @@
           <w:numId w:val="6"/>
         </w:numPr>
       </w:pPr>
-      <w:bookmarkStart w:id="13" w:name="_Toc202291840"/>
+      <w:bookmarkStart w:id="13" w:name="_Toc202984706"/>
       <w:r>
         <w:lastRenderedPageBreak/>
         <w:t>Mecanismos de alteración de la calidad</w:t>
@@ -7384,13 +7454,7 @@
         <w:rPr>
           <w:lang w:val="es-419" w:eastAsia="es-CO"/>
         </w:rPr>
-        <w:t>e</w:t>
-      </w:r>
-      <w:r>
-        <w:rPr>
-          <w:lang w:val="es-419" w:eastAsia="es-CO"/>
-        </w:rPr>
-        <w:t>stas alteraciones son reacciones del producto frente a condiciones ambientales adversas. Por ejemplo, temperaturas muy bajas pueden provocar daños por frío, como el oscurecimiento de la cáscara en bananas o la aparición de manchas acuosas en tomates. También, una alta humedad puede acelerar la pérdida de firmeza en verduras de hoja, como la lechuga, debido a la absorción excesiva de agua.</w:t>
+        <w:t>estas alteraciones son reacciones del producto frente a condiciones ambientales adversas. Por ejemplo, temperaturas muy bajas pueden provocar daños por frío, como el oscurecimiento de la cáscara en bananas o la aparición de manchas acuosas en tomates. También, una alta humedad puede acelerar la pérdida de firmeza en verduras de hoja, como la lechuga, debido a la absorción excesiva de agua.</w:t>
       </w:r>
       <w:r>
         <w:rPr>
@@ -7520,7 +7584,7 @@
       <w:pPr>
         <w:pStyle w:val="Ttulo1"/>
       </w:pPr>
-      <w:bookmarkStart w:id="14" w:name="_Toc202291841"/>
+      <w:bookmarkStart w:id="14" w:name="_Toc202984707"/>
       <w:r>
         <w:lastRenderedPageBreak/>
         <w:t>Factores que afectan la calidad de frutas y verduras</w:t>
@@ -7554,7 +7618,7 @@
           <w:numId w:val="6"/>
         </w:numPr>
       </w:pPr>
-      <w:bookmarkStart w:id="15" w:name="_Toc202291842"/>
+      <w:bookmarkStart w:id="15" w:name="_Toc202984708"/>
       <w:r>
         <w:t>Factores internos</w:t>
       </w:r>
@@ -7591,15 +7655,7 @@
           <w:bCs/>
           <w:lang w:val="es-419" w:eastAsia="es-CO"/>
         </w:rPr>
-        <w:t>Composición química:</w:t>
-      </w:r>
-      <w:r>
-        <w:rPr>
-          <w:b/>
-          <w:bCs/>
-          <w:lang w:val="es-419" w:eastAsia="es-CO"/>
-        </w:rPr>
-        <w:t xml:space="preserve"> </w:t>
+        <w:t xml:space="preserve">Composición química: </w:t>
       </w:r>
       <w:r>
         <w:rPr>
@@ -7632,7 +7688,19 @@
         <w:rPr>
           <w:lang w:val="es-419" w:eastAsia="es-CO"/>
         </w:rPr>
-        <w:t xml:space="preserve"> este factor determina la resistencia del producto al manejo postcosecha y su susceptibilidad al deterioro. Los productos inmaduros tienden a ser más vulnerables a daños mecánicos y a un mayor deterioro, mientras que los productos en su punto óptimo de madurez suelen tener mejores características de calidad y mayor vida útil.</w:t>
+        <w:t xml:space="preserve"> este factor determina la resistencia del producto al manejo </w:t>
+      </w:r>
+      <w:r>
+        <w:rPr>
+          <w:lang w:val="es-419" w:eastAsia="es-CO"/>
+        </w:rPr>
+        <w:t>poscosecha</w:t>
+      </w:r>
+      <w:r>
+        <w:rPr>
+          <w:lang w:val="es-419" w:eastAsia="es-CO"/>
+        </w:rPr>
+        <w:t xml:space="preserve"> y su susceptibilidad al deterioro. Los productos inmaduros tienden a ser más vulnerables a daños mecánicos y a un mayor deterioro, mientras que los productos en su punto óptimo de madurez suelen tener mejores características de calidad y mayor vida útil.</w:t>
       </w:r>
     </w:p>
     <w:p>
@@ -7659,19 +7727,7 @@
         <w:rPr>
           <w:lang w:val="es-419" w:eastAsia="es-CO"/>
         </w:rPr>
-        <w:t>:</w:t>
-      </w:r>
-      <w:r>
-        <w:rPr>
-          <w:lang w:val="es-419" w:eastAsia="es-CO"/>
-        </w:rPr>
-        <w:t xml:space="preserve"> l</w:t>
-      </w:r>
-      <w:r>
-        <w:rPr>
-          <w:lang w:val="es-419" w:eastAsia="es-CO"/>
-        </w:rPr>
-        <w:t>as enzimas presentes en el producto vegetal juegan un papel crucial en procesos como el pardeamiento y el ablandamiento. Estas reacciones pueden alterar el color, la textura y el sabor del producto, afectando su aceptación en el mercado.</w:t>
+        <w:t>: las enzimas presentes en el producto vegetal juegan un papel crucial en procesos como el pardeamiento y el ablandamiento. Estas reacciones pueden alterar el color, la textura y el sabor del producto, afectando su aceptación en el mercado.</w:t>
       </w:r>
     </w:p>
     <w:p>
@@ -7691,27 +7747,25 @@
           <w:bCs/>
           <w:lang w:val="es-419" w:eastAsia="es-CO"/>
         </w:rPr>
-        <w:t>Respiración y transpiración:</w:t>
-      </w:r>
-      <w:r>
-        <w:rPr>
-          <w:b/>
-          <w:bCs/>
-          <w:lang w:val="es-419" w:eastAsia="es-CO"/>
-        </w:rPr>
-        <w:t xml:space="preserve"> </w:t>
-      </w:r>
-      <w:r>
-        <w:rPr>
-          <w:lang w:val="es-419" w:eastAsia="es-CO"/>
-        </w:rPr>
-        <w:t>e</w:t>
-      </w:r>
-      <w:r>
-        <w:rPr>
-          <w:lang w:val="es-419" w:eastAsia="es-CO"/>
-        </w:rPr>
-        <w:t xml:space="preserve">stos procesos fisiológicos afectan la pérdida de peso y la calidad del producto durante la postcosecha. La respiración </w:t>
+        <w:t xml:space="preserve">Respiración y transpiración: </w:t>
+      </w:r>
+      <w:r>
+        <w:rPr>
+          <w:lang w:val="es-419" w:eastAsia="es-CO"/>
+        </w:rPr>
+        <w:t xml:space="preserve">estos procesos fisiológicos afectan la pérdida de peso y la calidad del producto durante la </w:t>
+      </w:r>
+      <w:r>
+        <w:rPr>
+          <w:lang w:val="es-419" w:eastAsia="es-CO"/>
+        </w:rPr>
+        <w:t>poscosecha</w:t>
+      </w:r>
+      <w:r>
+        <w:rPr>
+          <w:lang w:val="es-419" w:eastAsia="es-CO"/>
+        </w:rPr>
+        <w:t xml:space="preserve">. La respiración </w:t>
       </w:r>
       <w:r>
         <w:rPr>
@@ -7729,7 +7783,7 @@
           <w:numId w:val="6"/>
         </w:numPr>
       </w:pPr>
-      <w:bookmarkStart w:id="16" w:name="_Toc202291843"/>
+      <w:bookmarkStart w:id="16" w:name="_Toc202984709"/>
       <w:r>
         <w:t>Factores externos</w:t>
       </w:r>
@@ -7765,15 +7819,7 @@
           <w:bCs/>
           <w:lang w:val="es-419" w:eastAsia="es-CO"/>
         </w:rPr>
-        <w:t>Temperatura:</w:t>
-      </w:r>
-      <w:r>
-        <w:rPr>
-          <w:b/>
-          <w:bCs/>
-          <w:lang w:val="es-419" w:eastAsia="es-CO"/>
-        </w:rPr>
-        <w:t xml:space="preserve"> </w:t>
+        <w:t xml:space="preserve">Temperatura: </w:t>
       </w:r>
       <w:r>
         <w:rPr>
@@ -7837,13 +7883,7 @@
         <w:rPr>
           <w:lang w:val="es-419" w:eastAsia="es-CO"/>
         </w:rPr>
-        <w:t xml:space="preserve"> </w:t>
-      </w:r>
-      <w:r>
-        <w:rPr>
-          <w:lang w:val="es-419" w:eastAsia="es-CO"/>
-        </w:rPr>
-        <w:t>la exposición a la luz tiene efectos sobre la pigmentación, promoviendo la formación de ciertos colores en los vegetales. También influye en la fotosíntesis residual y puede desencadenar la aparición de brotes en algunas especies, afectando su calidad y aspecto visual.</w:t>
+        <w:t xml:space="preserve"> la exposición a la luz tiene efectos sobre la pigmentación, promoviendo la formación de ciertos colores en los vegetales. También influye en la fotosíntesis residual y puede desencadenar la aparición de brotes en algunas especies, afectando su calidad y aspecto visual.</w:t>
       </w:r>
     </w:p>
     <w:p>
@@ -7863,25 +7903,33 @@
           <w:bCs/>
           <w:lang w:val="es-419" w:eastAsia="es-CO"/>
         </w:rPr>
-        <w:t>Manejo postcosecha</w:t>
-      </w:r>
-      <w:r>
-        <w:rPr>
-          <w:lang w:val="es-419" w:eastAsia="es-CO"/>
-        </w:rPr>
-        <w:t>:</w:t>
-      </w:r>
-      <w:r>
-        <w:rPr>
-          <w:lang w:val="es-419" w:eastAsia="es-CO"/>
-        </w:rPr>
-        <w:t xml:space="preserve"> </w:t>
-      </w:r>
-      <w:r>
-        <w:rPr>
-          <w:lang w:val="es-419" w:eastAsia="es-CO"/>
-        </w:rPr>
-        <w:t>la manipulación inadecuada durante la postcosecha puede causar golpes, cortes o contaminaciones, lo que compromete la integridad física y microbiológica del producto, reduciendo su vida útil y calidad.</w:t>
+        <w:t xml:space="preserve">Manejo </w:t>
+      </w:r>
+      <w:r>
+        <w:rPr>
+          <w:b/>
+          <w:bCs/>
+          <w:lang w:val="es-419" w:eastAsia="es-CO"/>
+        </w:rPr>
+        <w:t>poscosecha</w:t>
+      </w:r>
+      <w:r>
+        <w:rPr>
+          <w:lang w:val="es-419" w:eastAsia="es-CO"/>
+        </w:rPr>
+        <w:t xml:space="preserve">: la manipulación inadecuada durante la </w:t>
+      </w:r>
+      <w:r>
+        <w:rPr>
+          <w:lang w:val="es-419" w:eastAsia="es-CO"/>
+        </w:rPr>
+        <w:t>poscosecha</w:t>
+      </w:r>
+      <w:r>
+        <w:rPr>
+          <w:lang w:val="es-419" w:eastAsia="es-CO"/>
+        </w:rPr>
+        <w:t xml:space="preserve"> puede causar golpes, cortes o contaminaciones, lo que compromete la integridad física y microbiológica del producto, reduciendo su vida útil y calidad.</w:t>
       </w:r>
     </w:p>
     <w:p>
@@ -7945,6 +7993,7 @@
           <w:p>
             <w:pPr>
               <w:pStyle w:val="Tablas"/>
+              <w:jc w:val="center"/>
               <w:rPr>
                 <w:b/>
                 <w:bCs w:val="0"/>
@@ -7966,6 +8015,7 @@
           <w:p>
             <w:pPr>
               <w:pStyle w:val="Tablas"/>
+              <w:jc w:val="center"/>
               <w:rPr>
                 <w:b/>
                 <w:bCs w:val="0"/>
@@ -7987,6 +8037,7 @@
           <w:p>
             <w:pPr>
               <w:pStyle w:val="Tablas"/>
+              <w:jc w:val="center"/>
               <w:rPr>
                 <w:b/>
                 <w:bCs w:val="0"/>
@@ -8115,8 +8166,18 @@
                 <w:bCs w:val="0"/>
                 <w:szCs w:val="28"/>
               </w:rPr>
-              <w:t>Temperatura, humedad relativa, luz y manejo postcosecha</w:t>
-            </w:r>
+              <w:t xml:space="preserve">Temperatura, humedad relativa, luz y manejo </w:t>
+            </w:r>
+            <w:proofErr w:type="spellStart"/>
+            <w:r>
+              <w:rPr>
+                <w:b w:val="0"/>
+                <w:bCs w:val="0"/>
+                <w:szCs w:val="28"/>
+              </w:rPr>
+              <w:t>poscosecha</w:t>
+            </w:r>
+            <w:proofErr w:type="spellEnd"/>
           </w:p>
         </w:tc>
         <w:tc>
@@ -8231,7 +8292,7 @@
       <w:pPr>
         <w:pStyle w:val="Ttulo1"/>
       </w:pPr>
-      <w:bookmarkStart w:id="17" w:name="_Toc202291844"/>
+      <w:bookmarkStart w:id="17" w:name="_Toc202984710"/>
       <w:r>
         <w:lastRenderedPageBreak/>
         <w:t>Alteraciones físicas, químicas y microbiológicas</w:t>
@@ -8255,7 +8316,7 @@
       <w:pPr>
         <w:pStyle w:val="Ttulo2"/>
       </w:pPr>
-      <w:bookmarkStart w:id="18" w:name="_Toc202291845"/>
+      <w:bookmarkStart w:id="18" w:name="_Toc202984711"/>
       <w:r>
         <w:t>5.1 Alteraciones físicas</w:t>
       </w:r>
@@ -8390,7 +8451,7 @@
       <w:pPr>
         <w:pStyle w:val="Ttulo2"/>
       </w:pPr>
-      <w:bookmarkStart w:id="19" w:name="_Toc202291846"/>
+      <w:bookmarkStart w:id="19" w:name="_Toc202984712"/>
       <w:r>
         <w:t>5.2 Alteraciones químicas</w:t>
       </w:r>
@@ -8426,27 +8487,13 @@
           <w:bCs/>
           <w:lang w:val="es-419" w:eastAsia="es-CO"/>
         </w:rPr>
-        <w:t>Pardeamiento enzimátic</w:t>
-      </w:r>
-      <w:r>
-        <w:rPr>
-          <w:b/>
-          <w:bCs/>
-          <w:lang w:val="es-419" w:eastAsia="es-CO"/>
-        </w:rPr>
-        <w:t>o</w:t>
-      </w:r>
-      <w:r>
-        <w:rPr>
-          <w:lang w:val="es-419" w:eastAsia="es-CO"/>
-        </w:rPr>
-        <w:t>: e</w:t>
-      </w:r>
-      <w:r>
-        <w:rPr>
-          <w:lang w:val="es-419" w:eastAsia="es-CO"/>
-        </w:rPr>
-        <w:t>s un cambio de color que oscurece frutas y verduras cuando se cortan o dañan. Ocurre por la acción de una enzima llamada polifenoloxidasa (PPO), que reacciona con el oxígeno del aire.</w:t>
+        <w:t>Pardeamiento enzimático</w:t>
+      </w:r>
+      <w:r>
+        <w:rPr>
+          <w:lang w:val="es-419" w:eastAsia="es-CO"/>
+        </w:rPr>
+        <w:t>: es un cambio de color que oscurece frutas y verduras cuando se cortan o dañan. Ocurre por la acción de una enzima llamada polifenoloxidasa (PPO), que reacciona con el oxígeno del aire.</w:t>
       </w:r>
       <w:r>
         <w:rPr>
@@ -8472,27 +8519,13 @@
           <w:bCs/>
           <w:lang w:val="es-419" w:eastAsia="es-CO"/>
         </w:rPr>
-        <w:t>Liposoxidación</w:t>
-      </w:r>
-      <w:r>
-        <w:rPr>
-          <w:b/>
-          <w:bCs/>
-          <w:lang w:val="es-419" w:eastAsia="es-CO"/>
-        </w:rPr>
-        <w:t>:</w:t>
-      </w:r>
-      <w:r>
-        <w:rPr>
-          <w:lang w:val="es-419" w:eastAsia="es-CO"/>
-        </w:rPr>
-        <w:t xml:space="preserve"> e</w:t>
-      </w:r>
-      <w:r>
-        <w:rPr>
-          <w:lang w:val="es-419" w:eastAsia="es-CO"/>
-        </w:rPr>
-        <w:t xml:space="preserve">s la degradación de las grasas insaturadas presentes en algunos vegetales, especialmente durante el almacenamiento. Esta </w:t>
+        <w:t>Liposoxidación:</w:t>
+      </w:r>
+      <w:r>
+        <w:rPr>
+          <w:lang w:val="es-419" w:eastAsia="es-CO"/>
+        </w:rPr>
+        <w:t xml:space="preserve"> es la degradación de las grasas insaturadas presentes en algunos vegetales, especialmente durante el almacenamiento. Esta </w:t>
       </w:r>
       <w:r>
         <w:rPr>
@@ -8525,34 +8558,20 @@
           <w:bCs/>
           <w:lang w:val="es-419" w:eastAsia="es-CO"/>
         </w:rPr>
-        <w:t>Reacciones de Maillard</w:t>
-      </w:r>
-      <w:r>
-        <w:rPr>
-          <w:b/>
-          <w:bCs/>
-          <w:lang w:val="es-419" w:eastAsia="es-CO"/>
-        </w:rPr>
-        <w:t>:</w:t>
-      </w:r>
-      <w:r>
-        <w:rPr>
-          <w:lang w:val="es-419" w:eastAsia="es-CO"/>
-        </w:rPr>
-        <w:t xml:space="preserve"> o</w:t>
-      </w:r>
-      <w:r>
-        <w:rPr>
-          <w:lang w:val="es-419" w:eastAsia="es-CO"/>
-        </w:rPr>
-        <w:t>curren cuando los azúcares naturales se combinan con proteínas en presencia de calor, lo que genera un cambio de color (dorado) y sabor característico. Es común durante procesos de cocción o secado.</w:t>
+        <w:t>Reacciones de Maillard:</w:t>
+      </w:r>
+      <w:r>
+        <w:rPr>
+          <w:lang w:val="es-419" w:eastAsia="es-CO"/>
+        </w:rPr>
+        <w:t xml:space="preserve"> ocurren cuando los azúcares naturales se combinan con proteínas en presencia de calor, lo que genera un cambio de color (dorado) y sabor característico. Es común durante procesos de cocción o secado.</w:t>
       </w:r>
     </w:p>
     <w:p>
       <w:pPr>
         <w:pStyle w:val="Ttulo2"/>
       </w:pPr>
-      <w:bookmarkStart w:id="20" w:name="_Toc202291847"/>
+      <w:bookmarkStart w:id="20" w:name="_Toc202984713"/>
       <w:r>
         <w:t>5.3 Alteraciones microbiológicas</w:t>
       </w:r>
@@ -8627,15 +8646,7 @@
           <w:bCs/>
           <w:lang w:val="es-419" w:eastAsia="es-CO"/>
         </w:rPr>
-        <w:t>Moho gris</w:t>
-      </w:r>
-      <w:r>
-        <w:rPr>
-          <w:b/>
-          <w:bCs/>
-          <w:lang w:val="es-419" w:eastAsia="es-CO"/>
-        </w:rPr>
-        <w:t>:</w:t>
+        <w:t>Moho gris:</w:t>
       </w:r>
       <w:r>
         <w:rPr>
@@ -8654,7 +8665,19 @@
         <w:rPr>
           <w:lang w:val="es-419" w:eastAsia="es-CO"/>
         </w:rPr>
-        <w:t xml:space="preserve"> es un hongo que prolifera en ambientes húmedos. Se caracteriza por una capa gris visible que acelera la descomposición de frutas blandas y jugosas, especialmente en postcosecha.</w:t>
+        <w:t xml:space="preserve"> es un hongo que prolifera en ambientes húmedos. Se caracteriza por una capa gris visible que acelera la descomposición de frutas blandas y jugosas, especialmente en </w:t>
+      </w:r>
+      <w:r>
+        <w:rPr>
+          <w:lang w:val="es-419" w:eastAsia="es-CO"/>
+        </w:rPr>
+        <w:t>poscosecha</w:t>
+      </w:r>
+      <w:r>
+        <w:rPr>
+          <w:lang w:val="es-419" w:eastAsia="es-CO"/>
+        </w:rPr>
+        <w:t>.</w:t>
       </w:r>
     </w:p>
     <w:p>
@@ -8674,15 +8697,7 @@
           <w:bCs/>
           <w:lang w:val="es-419" w:eastAsia="es-CO"/>
         </w:rPr>
-        <w:t>Antracnosis</w:t>
-      </w:r>
-      <w:r>
-        <w:rPr>
-          <w:b/>
-          <w:bCs/>
-          <w:lang w:val="es-419" w:eastAsia="es-CO"/>
-        </w:rPr>
-        <w:t>:</w:t>
+        <w:t>Antracnosis:</w:t>
       </w:r>
       <w:r>
         <w:rPr>
@@ -8723,7 +8738,7 @@
       <w:pPr>
         <w:pStyle w:val="Ttulo1"/>
       </w:pPr>
-      <w:bookmarkStart w:id="21" w:name="_Toc202291848"/>
+      <w:bookmarkStart w:id="21" w:name="_Toc202984714"/>
       <w:r>
         <w:lastRenderedPageBreak/>
         <w:t>Procesos de conservación</w:t>
@@ -8751,7 +8766,7 @@
           <w:numId w:val="6"/>
         </w:numPr>
       </w:pPr>
-      <w:bookmarkStart w:id="22" w:name="_Toc202291849"/>
+      <w:bookmarkStart w:id="22" w:name="_Toc202984715"/>
       <w:r>
         <w:t>Métodos físicos</w:t>
       </w:r>
@@ -8790,13 +8805,7 @@
         <w:rPr>
           <w:lang w:val="es-419" w:eastAsia="es-CO"/>
         </w:rPr>
-        <w:t>d</w:t>
-      </w:r>
-      <w:r>
-        <w:rPr>
-          <w:lang w:val="es-419" w:eastAsia="es-CO"/>
-        </w:rPr>
-        <w:t>isminuye la velocidad de respiración y el desarrollo microbiano. Se recomienda mantener temperaturas entre 0 °C y 10 °C.</w:t>
+        <w:t>disminuye la velocidad de respiración y el desarrollo microbiano. Se recomienda mantener temperaturas entre 0 °C y 10 °C.</w:t>
       </w:r>
     </w:p>
     <w:p>
@@ -8874,13 +8883,7 @@
         <w:rPr>
           <w:lang w:val="es-419" w:eastAsia="es-CO"/>
         </w:rPr>
-        <w:t>e</w:t>
-      </w:r>
-      <w:r>
-        <w:rPr>
-          <w:lang w:val="es-419" w:eastAsia="es-CO"/>
-        </w:rPr>
-        <w:t>limina el agua disponible, evitando el crecimiento de microorganismos.</w:t>
+        <w:t>elimina el agua disponible, evitando el crecimiento de microorganismos.</w:t>
       </w:r>
     </w:p>
     <w:p>
@@ -8902,15 +8905,7 @@
           <w:bCs/>
           <w:lang w:val="es-419" w:eastAsia="es-CO"/>
         </w:rPr>
-        <w:t>Radiación ionizant</w:t>
-      </w:r>
-      <w:r>
-        <w:rPr>
-          <w:b/>
-          <w:bCs/>
-          <w:lang w:val="es-419" w:eastAsia="es-CO"/>
-        </w:rPr>
-        <w:t>e</w:t>
+        <w:t>Radiación ionizante</w:t>
       </w:r>
       <w:r>
         <w:rPr>
@@ -8924,13 +8919,7 @@
         <w:rPr>
           <w:lang w:val="es-419" w:eastAsia="es-CO"/>
         </w:rPr>
-        <w:t>d</w:t>
-      </w:r>
-      <w:r>
-        <w:rPr>
-          <w:lang w:val="es-419" w:eastAsia="es-CO"/>
-        </w:rPr>
-        <w:t>isminuye la carga microbiana sin afectar significativamente las propiedades sensoriales.</w:t>
+        <w:t>disminuye la carga microbiana sin afectar significativamente las propiedades sensoriales.</w:t>
       </w:r>
     </w:p>
     <w:p>
@@ -8966,13 +8955,7 @@
         <w:rPr>
           <w:lang w:val="es-419" w:eastAsia="es-CO"/>
         </w:rPr>
-        <w:t>c</w:t>
-      </w:r>
-      <w:r>
-        <w:rPr>
-          <w:lang w:val="es-419" w:eastAsia="es-CO"/>
-        </w:rPr>
-        <w:t>ontrola la composición de gases (O₂, CO₂ y N₂) dentro del empaque para ralentizar el deterioro.</w:t>
+        <w:t>controla la composición de gases (O₂, CO₂ y N₂) dentro del empaque para ralentizar el deterioro.</w:t>
       </w:r>
     </w:p>
     <w:p>
@@ -8983,7 +8966,7 @@
           <w:numId w:val="6"/>
         </w:numPr>
       </w:pPr>
-      <w:bookmarkStart w:id="23" w:name="_Toc202291850"/>
+      <w:bookmarkStart w:id="23" w:name="_Toc202984716"/>
       <w:r>
         <w:t>Métodos químicos</w:t>
       </w:r>
@@ -9083,7 +9066,7 @@
           <w:numId w:val="6"/>
         </w:numPr>
       </w:pPr>
-      <w:bookmarkStart w:id="24" w:name="_Toc202291851"/>
+      <w:bookmarkStart w:id="24" w:name="_Toc202984717"/>
       <w:r>
         <w:t>Métodos biotecnológicos</w:t>
       </w:r>
@@ -9194,7 +9177,7 @@
       <w:pPr>
         <w:pStyle w:val="Ttulo1"/>
       </w:pPr>
-      <w:bookmarkStart w:id="25" w:name="_Toc202291852"/>
+      <w:bookmarkStart w:id="25" w:name="_Toc202984718"/>
       <w:r>
         <w:lastRenderedPageBreak/>
         <w:t>Aspectos higiénicos en la elaboración de conservas</w:t>
@@ -9254,7 +9237,7 @@
           <w:numId w:val="6"/>
         </w:numPr>
       </w:pPr>
-      <w:bookmarkStart w:id="26" w:name="_Toc202291853"/>
+      <w:bookmarkStart w:id="26" w:name="_Toc202984719"/>
       <w:r>
         <w:t>Ingredientes básicos en conservas</w:t>
       </w:r>
@@ -9522,7 +9505,7 @@
           <w:numId w:val="6"/>
         </w:numPr>
       </w:pPr>
-      <w:bookmarkStart w:id="27" w:name="_Toc202291854"/>
+      <w:bookmarkStart w:id="27" w:name="_Toc202984720"/>
       <w:r>
         <w:t>Materiales y equipos necesarios</w:t>
       </w:r>
@@ -9582,27 +9565,13 @@
           <w:bCs/>
           <w:lang w:val="es-ES" w:eastAsia="es-CO"/>
         </w:rPr>
-        <w:t>Envases de vidrio templado</w:t>
-      </w:r>
-      <w:r>
-        <w:rPr>
-          <w:b/>
-          <w:bCs/>
+        <w:t>Envases de vidrio templado:</w:t>
+      </w:r>
+      <w:r>
+        <w:rPr>
           <w:lang w:val="es-ES" w:eastAsia="es-CO"/>
         </w:rPr>
-        <w:t>:</w:t>
-      </w:r>
-      <w:r>
-        <w:rPr>
-          <w:lang w:val="es-ES" w:eastAsia="es-CO"/>
-        </w:rPr>
-        <w:t xml:space="preserve"> l</w:t>
-      </w:r>
-      <w:r>
-        <w:rPr>
-          <w:lang w:val="es-ES" w:eastAsia="es-CO"/>
-        </w:rPr>
-        <w:t>os envases de vidrio templado son ideales para conservas debido a su resistencia térmica y química. Antes de su uso, deben ser inspeccionados visualmente para evitar grietas o defectos que puedan comprometer la seguridad del producto.</w:t>
+        <w:t xml:space="preserve"> los envases de vidrio templado son ideales para conservas debido a su resistencia térmica y química. Antes de su uso, deben ser inspeccionados visualmente para evitar grietas o defectos que puedan comprometer la seguridad del producto.</w:t>
       </w:r>
     </w:p>
     <w:p>
@@ -9622,27 +9591,13 @@
           <w:bCs/>
           <w:lang w:val="es-ES" w:eastAsia="es-CO"/>
         </w:rPr>
-        <w:t>Tapas herméticas</w:t>
-      </w:r>
-      <w:r>
-        <w:rPr>
-          <w:b/>
-          <w:bCs/>
+        <w:t>Tapas herméticas:</w:t>
+      </w:r>
+      <w:r>
+        <w:rPr>
           <w:lang w:val="es-ES" w:eastAsia="es-CO"/>
         </w:rPr>
-        <w:t>:</w:t>
-      </w:r>
-      <w:r>
-        <w:rPr>
-          <w:lang w:val="es-ES" w:eastAsia="es-CO"/>
-        </w:rPr>
-        <w:t xml:space="preserve"> l</w:t>
-      </w:r>
-      <w:r>
-        <w:rPr>
-          <w:lang w:val="es-ES" w:eastAsia="es-CO"/>
-        </w:rPr>
-        <w:t xml:space="preserve">as tapas tipo </w:t>
+        <w:t xml:space="preserve"> las tapas tipo </w:t>
       </w:r>
       <w:r>
         <w:rPr>
@@ -9698,13 +9653,7 @@
         <w:rPr>
           <w:lang w:val="es-ES" w:eastAsia="es-CO"/>
         </w:rPr>
-        <w:t>: u</w:t>
-      </w:r>
-      <w:r>
-        <w:rPr>
-          <w:lang w:val="es-ES" w:eastAsia="es-CO"/>
-        </w:rPr>
-        <w:t>tilizados en producciones de pequeña escala, las autoclaves permiten alcanzar temperaturas de 121 °C, esenciales para eliminar esporas bacterianas, especialmente en conservas de baja acidez.</w:t>
+        <w:t>: utilizados en producciones de pequeña escala, las autoclaves permiten alcanzar temperaturas de 121 °C, esenciales para eliminar esporas bacterianas, especialmente en conservas de baja acidez.</w:t>
       </w:r>
     </w:p>
     <w:p>
@@ -9732,27 +9681,13 @@
           <w:lang w:val="es-ES" w:eastAsia="es-CO"/>
         </w:rPr>
         <w:lastRenderedPageBreak/>
-        <w:t>Termómetros digitales</w:t>
-      </w:r>
-      <w:r>
-        <w:rPr>
-          <w:b/>
-          <w:bCs/>
+        <w:t>Termómetros digitales:</w:t>
+      </w:r>
+      <w:r>
+        <w:rPr>
           <w:lang w:val="es-ES" w:eastAsia="es-CO"/>
         </w:rPr>
-        <w:t>:</w:t>
-      </w:r>
-      <w:r>
-        <w:rPr>
-          <w:lang w:val="es-ES" w:eastAsia="es-CO"/>
-        </w:rPr>
-        <w:t xml:space="preserve"> d</w:t>
-      </w:r>
-      <w:r>
-        <w:rPr>
-          <w:lang w:val="es-ES" w:eastAsia="es-CO"/>
-        </w:rPr>
-        <w:t>urante el llenado en caliente, es crucial usar termómetros digitales para asegurar que los alimentos alcancen temperaturas superiores a 85 °C, lo que previene la contaminación y asegura el sellado adecuado.</w:t>
+        <w:t xml:space="preserve"> durante el llenado en caliente, es crucial usar termómetros digitales para asegurar que los alimentos alcancen temperaturas superiores a 85 °C, lo que previene la contaminación y asegura el sellado adecuado.</w:t>
       </w:r>
     </w:p>
     <w:p>
@@ -9789,27 +9724,13 @@
           <w:bCs/>
           <w:lang w:val="es-ES" w:eastAsia="es-CO"/>
         </w:rPr>
-        <w:t>Envasado al vacío</w:t>
-      </w:r>
-      <w:r>
-        <w:rPr>
-          <w:b/>
-          <w:bCs/>
+        <w:t>Envasado al vacío:</w:t>
+      </w:r>
+      <w:r>
+        <w:rPr>
           <w:lang w:val="es-ES" w:eastAsia="es-CO"/>
         </w:rPr>
-        <w:t>:</w:t>
-      </w:r>
-      <w:r>
-        <w:rPr>
-          <w:lang w:val="es-ES" w:eastAsia="es-CO"/>
-        </w:rPr>
-        <w:t xml:space="preserve"> e</w:t>
-      </w:r>
-      <w:r>
-        <w:rPr>
-          <w:lang w:val="es-ES" w:eastAsia="es-CO"/>
-        </w:rPr>
-        <w:t>l envasado en bolsas especiales es cada vez más popular para productos como vegetales cocidos. Este método reduce la exposición al oxígeno y extiende la vida útil del producto sin necesidad de refrigeración.</w:t>
+        <w:t xml:space="preserve"> el envasado en bolsas especiales es cada vez más popular para productos como vegetales cocidos. Este método reduce la exposición al oxígeno y extiende la vida útil del producto sin necesidad de refrigeración.</w:t>
       </w:r>
     </w:p>
     <w:p>
@@ -9853,13 +9774,7 @@
         <w:rPr>
           <w:lang w:val="es-ES" w:eastAsia="es-CO"/>
         </w:rPr>
-        <w:t>: l</w:t>
-      </w:r>
-      <w:r>
-        <w:rPr>
-          <w:lang w:val="es-ES" w:eastAsia="es-CO"/>
-        </w:rPr>
-        <w:t>os envases ecológicos están alineados con las tendencias sostenibles, pero deben ser validados para garantizar su compatibilidad con tratamientos térmicos y el mantenimiento del vacío.</w:t>
+        <w:t>: los envases ecológicos están alineados con las tendencias sostenibles, pero deben ser validados para garantizar su compatibilidad con tratamientos térmicos y el mantenimiento del vacío.</w:t>
       </w:r>
     </w:p>
     <w:p>
@@ -9870,7 +9785,7 @@
           <w:numId w:val="6"/>
         </w:numPr>
       </w:pPr>
-      <w:bookmarkStart w:id="28" w:name="_Toc202291855"/>
+      <w:bookmarkStart w:id="28" w:name="_Toc202984721"/>
       <w:r>
         <w:t>Buenas prácticas de higiene y manipulación</w:t>
       </w:r>
@@ -10016,19 +9931,7 @@
         <w:rPr>
           <w:lang w:val="es-419" w:eastAsia="es-CO"/>
         </w:rPr>
-        <w:t>: desinfección secundaria</w:t>
-      </w:r>
-      <w:r>
-        <w:rPr>
-          <w:lang w:val="es-419" w:eastAsia="es-CO"/>
-        </w:rPr>
-        <w:t>: a</w:t>
-      </w:r>
-      <w:r>
-        <w:rPr>
-          <w:lang w:val="es-419" w:eastAsia="es-CO"/>
-        </w:rPr>
-        <w:t>plicación de solución de hipoclorito de sodio a 50 ppm durante mínimo 5 minutos. Posteriormente, enjuague con agua potable para remover restos químicos.</w:t>
+        <w:t>: desinfección secundaria: aplicación de solución de hipoclorito de sodio a 50 ppm durante mínimo 5 minutos. Posteriormente, enjuague con agua potable para remover restos químicos.</w:t>
       </w:r>
     </w:p>
     <w:p>
@@ -10449,19 +10352,7 @@
         <w:rPr>
           <w:lang w:val="es-419" w:eastAsia="es-CO"/>
         </w:rPr>
-        <w:t>:</w:t>
-      </w:r>
-      <w:r>
-        <w:rPr>
-          <w:lang w:val="es-419" w:eastAsia="es-CO"/>
-        </w:rPr>
-        <w:t xml:space="preserve"> </w:t>
-      </w:r>
-      <w:r>
-        <w:rPr>
-          <w:lang w:val="es-419" w:eastAsia="es-CO"/>
-        </w:rPr>
-        <w:t>uso de microscopios portátiles para identificar precozmente hongos filamentosos o contaminaciones superficiales.</w:t>
+        <w:t>: uso de microscopios portátiles para identificar precozmente hongos filamentosos o contaminaciones superficiales.</w:t>
       </w:r>
     </w:p>
     <w:p>
@@ -10485,6 +10376,12 @@
           <w:lang w:val="es-419" w:eastAsia="es-CO"/>
         </w:rPr>
         <w:t xml:space="preserve"> asegurar que las condiciones microbiológicas se mantengan dentro de los límites</w:t>
+      </w:r>
+      <w:r>
+        <w:rPr>
+          <w:lang w:val="es-419" w:eastAsia="es-CO"/>
+        </w:rPr>
+        <w:t>.</w:t>
       </w:r>
     </w:p>
     <w:p>
@@ -10569,15 +10466,7 @@
           <w:bCs/>
           <w:lang w:val="es-419" w:eastAsia="es-CO"/>
         </w:rPr>
-        <w:t>Separación física de líneas de producción:</w:t>
-      </w:r>
-      <w:r>
-        <w:rPr>
-          <w:b/>
-          <w:bCs/>
-          <w:lang w:val="es-419" w:eastAsia="es-CO"/>
-        </w:rPr>
-        <w:t xml:space="preserve"> </w:t>
+        <w:t xml:space="preserve">Separación física de líneas de producción: </w:t>
       </w:r>
       <w:r>
         <w:rPr>
@@ -10658,7 +10547,7 @@
           <w:numId w:val="6"/>
         </w:numPr>
       </w:pPr>
-      <w:bookmarkStart w:id="29" w:name="_Toc202291856"/>
+      <w:bookmarkStart w:id="29" w:name="_Toc202984722"/>
       <w:r>
         <w:t>Innovaciones en conservación</w:t>
       </w:r>
@@ -10788,7 +10677,19 @@
         <w:rPr>
           <w:lang w:val="es-419" w:eastAsia="es-CO"/>
         </w:rPr>
-        <w:t>Guacamole, salsas frescas, jugos prensados en frío, sopas listas entre otras.</w:t>
+        <w:t>Guacamole, salsas frescas, jugos prensados en frío, sopas listas</w:t>
+      </w:r>
+      <w:r>
+        <w:rPr>
+          <w:lang w:val="es-419" w:eastAsia="es-CO"/>
+        </w:rPr>
+        <w:t>,</w:t>
+      </w:r>
+      <w:r>
+        <w:rPr>
+          <w:lang w:val="es-419" w:eastAsia="es-CO"/>
+        </w:rPr>
+        <w:t xml:space="preserve"> entre otras.</w:t>
       </w:r>
     </w:p>
     <w:p>
@@ -11083,7 +10984,7 @@
       <w:pPr>
         <w:pStyle w:val="Titulosgenerales"/>
       </w:pPr>
-      <w:bookmarkStart w:id="30" w:name="_Toc202291857"/>
+      <w:bookmarkStart w:id="30" w:name="_Toc202984723"/>
       <w:r>
         <w:lastRenderedPageBreak/>
         <w:t>Síntesis</w:t>
@@ -11152,30 +11053,23 @@
           <w:lang w:val="es-419" w:eastAsia="es-CO"/>
         </w:rPr>
       </w:pPr>
-      <w:r>
-        <w:rPr>
-          <w:highlight w:val="yellow"/>
-          <w:lang w:val="es-419" w:eastAsia="es-CO"/>
-        </w:rPr>
-        <w:t>CAMBIAR IMAGEN</w:t>
-      </w:r>
-    </w:p>
-    <w:p>
-      <w:pPr>
-        <w:ind w:firstLine="0"/>
-        <w:rPr>
-          <w:lang w:val="es-419" w:eastAsia="es-CO"/>
-        </w:rPr>
-      </w:pPr>
-      <w:r>
-        <w:rPr>
+    </w:p>
+    <w:p>
+      <w:pPr>
+        <w:rPr>
+          <w:lang w:val="es-419" w:eastAsia="es-CO"/>
+        </w:rPr>
+      </w:pPr>
+      <w:r>
+        <w:rPr>
+          <w:noProof/>
           <w:lang w:val="es-419" w:eastAsia="es-CO"/>
         </w:rPr>
         <w:drawing>
-          <wp:inline distT="0" distB="0" distL="0" distR="0" wp14:anchorId="4BF621E6" wp14:editId="001E4527">
-            <wp:extent cx="6332220" cy="2131060"/>
-            <wp:effectExtent l="0" t="0" r="5080" b="2540"/>
-            <wp:docPr id="375298565" name="Imagen 1" descr="La imagen ilustra un diagrama de flujo en donde se describe las generalidades, ingredientes y aspectos higiénicos en la preparación de conservas."/>
+          <wp:inline distT="0" distB="0" distL="0" distR="0" wp14:anchorId="7663B36F" wp14:editId="1FAD8BD3">
+            <wp:extent cx="5624624" cy="2131060"/>
+            <wp:effectExtent l="0" t="0" r="1905" b="2540"/>
+            <wp:docPr id="1249851765" name="Imagen 1" descr="La imagen ilustra un diagrama de flujo en donde se describe las generalidades, ingredientes y aspectos higiénicos en la preparación de conservas."/>
             <wp:cNvGraphicFramePr>
               <a:graphicFrameLocks xmlns:a="http://schemas.openxmlformats.org/drawingml/2006/main" noChangeAspect="1"/>
             </wp:cNvGraphicFramePr>
@@ -11183,7 +11077,7 @@
               <a:graphicData uri="http://schemas.openxmlformats.org/drawingml/2006/picture">
                 <pic:pic xmlns:pic="http://schemas.openxmlformats.org/drawingml/2006/picture">
                   <pic:nvPicPr>
-                    <pic:cNvPr id="375298565" name="Imagen 1" descr="La imagen ilustra un diagrama de flujo en donde se describe las generalidades, ingredientes y aspectos higiénicos en la preparación de conservas."/>
+                    <pic:cNvPr id="1249851765" name="Imagen 1" descr="La imagen ilustra un diagrama de flujo en donde se describe las generalidades, ingredientes y aspectos higiénicos en la preparación de conservas."/>
                     <pic:cNvPicPr/>
                   </pic:nvPicPr>
                   <pic:blipFill>
@@ -11195,7 +11089,7 @@
                   <pic:spPr>
                     <a:xfrm>
                       <a:off x="0" y="0"/>
-                      <a:ext cx="6348317" cy="2136477"/>
+                      <a:ext cx="5630584" cy="2133318"/>
                     </a:xfrm>
                     <a:prstGeom prst="rect">
                       <a:avLst/>
@@ -11212,6 +11106,14 @@
       <w:pPr>
         <w:ind w:firstLine="0"/>
         <w:rPr>
+          <w:lang w:val="es-419" w:eastAsia="es-CO"/>
+        </w:rPr>
+      </w:pPr>
+    </w:p>
+    <w:p>
+      <w:pPr>
+        <w:ind w:firstLine="0"/>
+        <w:rPr>
           <w:noProof/>
           <w:lang w:val="es-419" w:eastAsia="es-CO"/>
         </w:rPr>
@@ -11221,7 +11123,7 @@
       <w:pPr>
         <w:pStyle w:val="Titulosgenerales"/>
       </w:pPr>
-      <w:bookmarkStart w:id="31" w:name="_Toc202291858"/>
+      <w:bookmarkStart w:id="31" w:name="_Toc202984724"/>
       <w:r>
         <w:lastRenderedPageBreak/>
         <w:t>Glosario</w:t>
@@ -11335,161 +11237,173 @@
           <w:szCs w:val="28"/>
           <w:lang w:val="es-419"/>
         </w:rPr>
-        <w:t>: compuestos naturales en frutas y verduras que no son nutrientes esenciales, pero sí beneficiosos para la salud, con propiedades preventivas</w:t>
-      </w:r>
-      <w:r>
+        <w:t>: compuestos naturales en frutas y verduras que no son nutrientes esenciales, pero sí beneficiosos para la salud, con propiedades preventivas.</w:t>
+      </w:r>
+    </w:p>
+    <w:p>
+      <w:pPr>
         <w:rPr>
           <w:rFonts w:ascii="Calibri" w:hAnsi="Calibri" w:cs="Calibri"/>
           <w:szCs w:val="28"/>
           <w:lang w:val="es-419"/>
         </w:rPr>
-        <w:t>.</w:t>
-      </w:r>
-    </w:p>
-    <w:p>
-      <w:pPr>
+      </w:pPr>
+      <w:r>
+        <w:rPr>
+          <w:rFonts w:ascii="Calibri" w:hAnsi="Calibri" w:cs="Calibri"/>
+          <w:b/>
+          <w:bCs/>
+          <w:szCs w:val="28"/>
+          <w:lang w:val="es-419"/>
+        </w:rPr>
+        <w:t xml:space="preserve">Flavonoides: </w:t>
+      </w:r>
+      <w:r>
         <w:rPr>
           <w:rFonts w:ascii="Calibri" w:hAnsi="Calibri" w:cs="Calibri"/>
           <w:szCs w:val="28"/>
           <w:lang w:val="es-419"/>
         </w:rPr>
-      </w:pPr>
-      <w:r>
-        <w:rPr>
-          <w:rFonts w:ascii="Calibri" w:hAnsi="Calibri" w:cs="Calibri"/>
-          <w:b/>
-          <w:bCs/>
-          <w:szCs w:val="28"/>
-          <w:lang w:val="es-419"/>
-        </w:rPr>
-        <w:t xml:space="preserve">Flavonoides: </w:t>
-      </w:r>
-      <w:r>
+        <w:t>tipo de polifenol con propiedades antiinflamatorias y antioxidantes, que contribuyen a la prevención de enfermedades crónicas.</w:t>
+      </w:r>
+    </w:p>
+    <w:p>
+      <w:pPr>
         <w:rPr>
           <w:rFonts w:ascii="Calibri" w:hAnsi="Calibri" w:cs="Calibri"/>
           <w:szCs w:val="28"/>
           <w:lang w:val="es-419"/>
         </w:rPr>
-        <w:t>tipo de polifenol con propiedades antiinflamatorias y antioxidantes, que contribuyen a la prevención de enfermedades crónicas.</w:t>
-      </w:r>
-    </w:p>
-    <w:p>
-      <w:pPr>
+      </w:pPr>
+      <w:r>
+        <w:rPr>
+          <w:rFonts w:ascii="Calibri" w:hAnsi="Calibri" w:cs="Calibri"/>
+          <w:b/>
+          <w:bCs/>
+          <w:szCs w:val="28"/>
+          <w:lang w:val="es-419"/>
+        </w:rPr>
+        <w:t xml:space="preserve">Frutas: </w:t>
+      </w:r>
+      <w:r>
         <w:rPr>
           <w:rFonts w:ascii="Calibri" w:hAnsi="Calibri" w:cs="Calibri"/>
           <w:szCs w:val="28"/>
           <w:lang w:val="es-419"/>
         </w:rPr>
-      </w:pPr>
-      <w:r>
-        <w:rPr>
-          <w:rFonts w:ascii="Calibri" w:hAnsi="Calibri" w:cs="Calibri"/>
-          <w:b/>
-          <w:bCs/>
-          <w:szCs w:val="28"/>
-          <w:lang w:val="es-419"/>
-        </w:rPr>
-        <w:t xml:space="preserve">Frutas: </w:t>
-      </w:r>
-      <w:r>
+        <w:t>productos vegetales que se desarrollan a partir del ovario de la flor, contienen semillas y suelen tener sabor dulce o ácido.</w:t>
+      </w:r>
+    </w:p>
+    <w:p>
+      <w:pPr>
         <w:rPr>
           <w:rFonts w:ascii="Calibri" w:hAnsi="Calibri" w:cs="Calibri"/>
           <w:szCs w:val="28"/>
           <w:lang w:val="es-419"/>
         </w:rPr>
-        <w:t>productos vegetales que se desarrollan a partir del ovario de la flor, contienen semillas y suelen tener sabor dulce o ácido.</w:t>
-      </w:r>
-    </w:p>
-    <w:p>
-      <w:pPr>
+      </w:pPr>
+      <w:r>
+        <w:rPr>
+          <w:rFonts w:ascii="Calibri" w:hAnsi="Calibri" w:cs="Calibri"/>
+          <w:b/>
+          <w:bCs/>
+          <w:szCs w:val="28"/>
+          <w:lang w:val="es-419"/>
+        </w:rPr>
+        <w:t xml:space="preserve">Minerales: </w:t>
+      </w:r>
+      <w:r>
         <w:rPr>
           <w:rFonts w:ascii="Calibri" w:hAnsi="Calibri" w:cs="Calibri"/>
           <w:szCs w:val="28"/>
           <w:lang w:val="es-419"/>
         </w:rPr>
-      </w:pPr>
-      <w:r>
-        <w:rPr>
-          <w:rFonts w:ascii="Calibri" w:hAnsi="Calibri" w:cs="Calibri"/>
-          <w:b/>
-          <w:bCs/>
-          <w:szCs w:val="28"/>
-          <w:lang w:val="es-419"/>
-        </w:rPr>
-        <w:t xml:space="preserve">Minerales: </w:t>
-      </w:r>
-      <w:r>
+        <w:t>micronutrientes inorgánicos esenciales para funciones como la formación de huesos, transporte de oxígeno y regulación del equilibrio hídrico.</w:t>
+      </w:r>
+    </w:p>
+    <w:p>
+      <w:pPr>
         <w:rPr>
           <w:rFonts w:ascii="Calibri" w:hAnsi="Calibri" w:cs="Calibri"/>
           <w:szCs w:val="28"/>
           <w:lang w:val="es-419"/>
         </w:rPr>
-        <w:t>micronutrientes inorgánicos esenciales para funciones como la formación de huesos, transporte de oxígeno y regulación del equilibrio hídrico.</w:t>
-      </w:r>
-    </w:p>
-    <w:p>
-      <w:pPr>
+      </w:pPr>
+      <w:r>
+        <w:rPr>
+          <w:rFonts w:ascii="Calibri" w:hAnsi="Calibri" w:cs="Calibri"/>
+          <w:b/>
+          <w:bCs/>
+          <w:szCs w:val="28"/>
+          <w:lang w:val="es-419"/>
+        </w:rPr>
+        <w:t xml:space="preserve">Pigmentos: </w:t>
+      </w:r>
+      <w:r>
         <w:rPr>
           <w:rFonts w:ascii="Calibri" w:hAnsi="Calibri" w:cs="Calibri"/>
           <w:szCs w:val="28"/>
           <w:lang w:val="es-419"/>
         </w:rPr>
-      </w:pPr>
-      <w:r>
-        <w:rPr>
-          <w:rFonts w:ascii="Calibri" w:hAnsi="Calibri" w:cs="Calibri"/>
-          <w:b/>
-          <w:bCs/>
-          <w:szCs w:val="28"/>
-          <w:lang w:val="es-419"/>
-        </w:rPr>
-        <w:t xml:space="preserve">Pigmentos: </w:t>
-      </w:r>
-      <w:r>
+        <w:t>sustancias que dan color a frutas y verduras, como las clorofilas, carotenoides y antocianinas. Actúan como antioxidantes.</w:t>
+      </w:r>
+    </w:p>
+    <w:p>
+      <w:pPr>
         <w:rPr>
           <w:rFonts w:ascii="Calibri" w:hAnsi="Calibri" w:cs="Calibri"/>
           <w:szCs w:val="28"/>
           <w:lang w:val="es-419"/>
         </w:rPr>
-        <w:t>sustancias que dan color a frutas y verduras, como las clorofilas, carotenoides y antocianinas. Actúan como antioxidantes.</w:t>
-      </w:r>
-    </w:p>
-    <w:p>
-      <w:pPr>
+      </w:pPr>
+      <w:r>
+        <w:rPr>
+          <w:rFonts w:ascii="Calibri" w:hAnsi="Calibri" w:cs="Calibri"/>
+          <w:b/>
+          <w:bCs/>
+          <w:szCs w:val="28"/>
+          <w:lang w:val="es-419"/>
+        </w:rPr>
+        <w:t xml:space="preserve">Polifenoles: </w:t>
+      </w:r>
+      <w:r>
         <w:rPr>
           <w:rFonts w:ascii="Calibri" w:hAnsi="Calibri" w:cs="Calibri"/>
           <w:szCs w:val="28"/>
           <w:lang w:val="es-419"/>
         </w:rPr>
-      </w:pPr>
-      <w:r>
-        <w:rPr>
-          <w:rFonts w:ascii="Calibri" w:hAnsi="Calibri" w:cs="Calibri"/>
-          <w:b/>
-          <w:bCs/>
-          <w:szCs w:val="28"/>
-          <w:lang w:val="es-419"/>
-        </w:rPr>
-        <w:t xml:space="preserve">Polifenoles: </w:t>
-      </w:r>
-      <w:r>
+        <w:t>fitoquímicos antioxidantes presentes en vegetales, que ayudan a prevenir enfermedades cardiovasculares y neurodegenerativas.</w:t>
+      </w:r>
+    </w:p>
+    <w:p>
+      <w:pPr>
         <w:rPr>
           <w:rFonts w:ascii="Calibri" w:hAnsi="Calibri" w:cs="Calibri"/>
           <w:szCs w:val="28"/>
           <w:lang w:val="es-419"/>
         </w:rPr>
-        <w:t>fitoquímicos antioxidantes presentes en vegetales, que ayudan a prevenir enfermedades cardiovasculares y neurodegenerativas.</w:t>
-      </w:r>
-    </w:p>
-    <w:p>
-      <w:pPr>
+      </w:pPr>
+      <w:r>
+        <w:rPr>
+          <w:rFonts w:ascii="Calibri" w:hAnsi="Calibri" w:cs="Calibri"/>
+          <w:b/>
+          <w:bCs/>
+          <w:szCs w:val="28"/>
+          <w:lang w:val="es-419"/>
+        </w:rPr>
+        <w:t xml:space="preserve">Verduras: </w:t>
+      </w:r>
+      <w:r>
         <w:rPr>
           <w:rFonts w:ascii="Calibri" w:hAnsi="Calibri" w:cs="Calibri"/>
           <w:szCs w:val="28"/>
           <w:lang w:val="es-419"/>
         </w:rPr>
-      </w:pPr>
-      <w:r>
+        <w:t>partes comestibles de plantas que no son frutas (como hojas, tallos, raíces o flores), generalmente con sabor menos dulce.</w:t>
+      </w:r>
+    </w:p>
+    <w:p>
+      <w:pPr>
         <w:rPr>
           <w:rFonts w:ascii="Calibri" w:hAnsi="Calibri" w:cs="Calibri"/>
           <w:b/>
@@ -11497,7 +11411,17 @@
           <w:szCs w:val="28"/>
           <w:lang w:val="es-419"/>
         </w:rPr>
-        <w:t xml:space="preserve">Verduras: </w:t>
+      </w:pPr>
+      <w:r>
+        <w:rPr>
+          <w:rFonts w:ascii="Calibri" w:hAnsi="Calibri" w:cs="Calibri"/>
+          <w:b/>
+          <w:bCs/>
+          <w:szCs w:val="28"/>
+          <w:lang w:val="es-419"/>
+        </w:rPr>
+        <w:lastRenderedPageBreak/>
+        <w:t xml:space="preserve">Vitamina C: </w:t>
       </w:r>
       <w:r>
         <w:rPr>
@@ -11505,7 +11429,26 @@
           <w:szCs w:val="28"/>
           <w:lang w:val="es-419"/>
         </w:rPr>
-        <w:t>partes comestibles de plantas que no son frutas (como hojas, tallos, raíces o flores), generalmente con sabor menos dulce</w:t>
+        <w:t>antioxidante presente en cítricos. Fortalece el sistema inmunológico, mejora la absorción del hierro y protege frente a infecciones.</w:t>
+      </w:r>
+    </w:p>
+    <w:p>
+      <w:pPr>
+        <w:rPr>
+          <w:rFonts w:ascii="Calibri" w:hAnsi="Calibri" w:cs="Calibri"/>
+          <w:szCs w:val="28"/>
+          <w:lang w:val="es-419" w:eastAsia="es-CO"/>
+        </w:rPr>
+      </w:pPr>
+      <w:r>
+        <w:rPr>
+          <w:rFonts w:ascii="Calibri" w:hAnsi="Calibri" w:cs="Calibri"/>
+          <w:b/>
+          <w:bCs/>
+          <w:szCs w:val="28"/>
+          <w:lang w:val="es-419"/>
+        </w:rPr>
+        <w:t xml:space="preserve">Vitaminas: </w:t>
       </w:r>
       <w:r>
         <w:rPr>
@@ -11513,29 +11456,7 @@
           <w:szCs w:val="28"/>
           <w:lang w:val="es-419"/>
         </w:rPr>
-        <w:t>.</w:t>
-      </w:r>
-    </w:p>
-    <w:p>
-      <w:pPr>
-        <w:rPr>
-          <w:rFonts w:ascii="Calibri" w:hAnsi="Calibri" w:cs="Calibri"/>
-          <w:b/>
-          <w:bCs/>
-          <w:szCs w:val="28"/>
-          <w:lang w:val="es-419"/>
-        </w:rPr>
-      </w:pPr>
-      <w:r>
-        <w:rPr>
-          <w:rFonts w:ascii="Calibri" w:hAnsi="Calibri" w:cs="Calibri"/>
-          <w:b/>
-          <w:bCs/>
-          <w:szCs w:val="28"/>
-          <w:lang w:val="es-419"/>
-        </w:rPr>
-        <w:lastRenderedPageBreak/>
-        <w:t xml:space="preserve">Vitamina C: </w:t>
+        <w:t>nutrientes esenciales presentes en frutas y verduras, importantes para el sistema inmune, la piel, la visión y el metabolismo</w:t>
       </w:r>
       <w:r>
         <w:rPr>
@@ -11543,11 +11464,13 @@
           <w:szCs w:val="28"/>
           <w:lang w:val="es-419"/>
         </w:rPr>
-        <w:t>antioxidante presente en cítricos. Fortalece el sistema inmunológico, mejora la absorción del hierro y protege frente a infecciones.</w:t>
-      </w:r>
-    </w:p>
-    <w:p>
-      <w:pPr>
+        <w:t>.</w:t>
+      </w:r>
+    </w:p>
+    <w:p>
+      <w:pPr>
+        <w:spacing w:before="0" w:after="160" w:line="259" w:lineRule="auto"/>
+        <w:ind w:firstLine="0"/>
         <w:rPr>
           <w:rFonts w:ascii="Calibri" w:hAnsi="Calibri" w:cs="Calibri"/>
           <w:szCs w:val="28"/>
@@ -11557,44 +11480,7 @@
       <w:r>
         <w:rPr>
           <w:rFonts w:ascii="Calibri" w:hAnsi="Calibri" w:cs="Calibri"/>
-          <w:b/>
-          <w:bCs/>
           <w:szCs w:val="28"/>
-          <w:lang w:val="es-419"/>
-        </w:rPr>
-        <w:t xml:space="preserve">Vitaminas: </w:t>
-      </w:r>
-      <w:r>
-        <w:rPr>
-          <w:rFonts w:ascii="Calibri" w:hAnsi="Calibri" w:cs="Calibri"/>
-          <w:szCs w:val="28"/>
-          <w:lang w:val="es-419"/>
-        </w:rPr>
-        <w:t>nutrientes esenciales presentes en frutas y verduras, importantes para el sistema inmune, la piel, la visión y el metabolismo</w:t>
-      </w:r>
-      <w:r>
-        <w:rPr>
-          <w:rFonts w:ascii="Calibri" w:hAnsi="Calibri" w:cs="Calibri"/>
-          <w:szCs w:val="28"/>
-          <w:lang w:val="es-419"/>
-        </w:rPr>
-        <w:t>.</w:t>
-      </w:r>
-    </w:p>
-    <w:p>
-      <w:pPr>
-        <w:spacing w:before="0" w:after="160" w:line="259" w:lineRule="auto"/>
-        <w:ind w:firstLine="0"/>
-        <w:rPr>
-          <w:rFonts w:ascii="Calibri" w:hAnsi="Calibri" w:cs="Calibri"/>
-          <w:szCs w:val="28"/>
-          <w:lang w:val="es-419" w:eastAsia="es-CO"/>
-        </w:rPr>
-      </w:pPr>
-      <w:r>
-        <w:rPr>
-          <w:rFonts w:ascii="Calibri" w:hAnsi="Calibri" w:cs="Calibri"/>
-          <w:szCs w:val="28"/>
           <w:lang w:val="es-419" w:eastAsia="es-CO"/>
         </w:rPr>
         <w:br w:type="page"/>
@@ -11604,7 +11490,7 @@
       <w:pPr>
         <w:pStyle w:val="Titulosgenerales"/>
       </w:pPr>
-      <w:bookmarkStart w:id="32" w:name="_Toc202291859"/>
+      <w:bookmarkStart w:id="32" w:name="_Toc202984725"/>
       <w:r>
         <w:lastRenderedPageBreak/>
         <w:t>Material complementario</w:t>
@@ -11760,7 +11646,21 @@
                 <w:sz w:val="28"/>
                 <w:szCs w:val="28"/>
               </w:rPr>
-              <w:t>Villar, L. (2010). Las Mejores conservas. Ed. Integral.</w:t>
+              <w:t>Villar, L. (2010). Las Mejores conservas. Ed</w:t>
+            </w:r>
+            <w:r>
+              <w:rPr>
+                <w:sz w:val="28"/>
+                <w:szCs w:val="28"/>
+              </w:rPr>
+              <w:t>itorial</w:t>
+            </w:r>
+            <w:r>
+              <w:rPr>
+                <w:sz w:val="28"/>
+                <w:szCs w:val="28"/>
+              </w:rPr>
+              <w:t xml:space="preserve"> Integral.</w:t>
             </w:r>
           </w:p>
         </w:tc>
@@ -11879,7 +11779,21 @@
                 <w:sz w:val="28"/>
                 <w:szCs w:val="28"/>
               </w:rPr>
-              <w:t>Organización de las Naciones Unidas para la Agricultura y la Alimentación. (1993). Prevención de pérdidas de alimentos poscosecha: frutas, hortalizas, raíces y tubérculos. (Colección FAO: Capacitación, N° 17/2). Roma: FAO.</w:t>
+              <w:t>Organización de las Naciones Unidas para la Agricultura y la Alimentación</w:t>
+            </w:r>
+            <w:r>
+              <w:rPr>
+                <w:sz w:val="28"/>
+                <w:szCs w:val="28"/>
+              </w:rPr>
+              <w:t xml:space="preserve"> (FAO)</w:t>
+            </w:r>
+            <w:r>
+              <w:rPr>
+                <w:sz w:val="28"/>
+                <w:szCs w:val="28"/>
+              </w:rPr>
+              <w:t>. (1993). Prevención de pérdidas de alimentos poscosecha: frutas, hortalizas, raíces y tubérculos. (Colección FAO: Capacitación, N° 17/2). Roma: FAO.</w:t>
             </w:r>
           </w:p>
         </w:tc>
@@ -11974,7 +11888,7 @@
       <w:pPr>
         <w:pStyle w:val="Titulosgenerales"/>
       </w:pPr>
-      <w:bookmarkStart w:id="33" w:name="_Toc202291860"/>
+      <w:bookmarkStart w:id="33" w:name="_Toc202984726"/>
       <w:r>
         <w:lastRenderedPageBreak/>
         <w:t>Referencias bibliográficas</w:t>
@@ -12000,9 +11914,84 @@
           <w:sz w:val="28"/>
           <w:szCs w:val="28"/>
         </w:rPr>
-        <w:t xml:space="preserve">FAO. (2016). Manejo postcosecha de frutas y hortalizas. Organización de las Naciones Unidas para la Alimentación y la Agricultura. </w:t>
+        <w:t xml:space="preserve">FAO. (2012). Pérdidas y desperdicio de alimentos en el mundo. Roma: Organización de las Naciones Unidas para la Agricultura y la Alimentación. </w:t>
       </w:r>
       <w:hyperlink r:id="rId19" w:history="1">
+        <w:r>
+          <w:rPr>
+            <w:rStyle w:val="Hipervnculo"/>
+            <w:rFonts w:asciiTheme="minorHAnsi" w:hAnsiTheme="minorHAnsi" w:cstheme="minorHAnsi"/>
+            <w:sz w:val="28"/>
+            <w:szCs w:val="28"/>
+          </w:rPr>
+          <w:t>https://www.fao.org/4/i2697s/i2697s.pdf</w:t>
+        </w:r>
+      </w:hyperlink>
+    </w:p>
+    <w:p>
+      <w:pPr>
+        <w:pStyle w:val="Normal0"/>
+        <w:ind w:firstLine="708"/>
+        <w:rPr>
+          <w:rFonts w:asciiTheme="minorHAnsi" w:hAnsiTheme="minorHAnsi" w:cstheme="minorHAnsi"/>
+          <w:sz w:val="28"/>
+          <w:szCs w:val="28"/>
+        </w:rPr>
+      </w:pPr>
+    </w:p>
+    <w:p>
+      <w:pPr>
+        <w:pStyle w:val="Normal0"/>
+        <w:ind w:firstLine="708"/>
+        <w:rPr>
+          <w:rFonts w:asciiTheme="minorHAnsi" w:hAnsiTheme="minorHAnsi" w:cstheme="minorHAnsi"/>
+          <w:sz w:val="28"/>
+          <w:szCs w:val="28"/>
+        </w:rPr>
+      </w:pPr>
+      <w:r>
+        <w:rPr>
+          <w:rFonts w:asciiTheme="minorHAnsi" w:hAnsiTheme="minorHAnsi" w:cstheme="minorHAnsi"/>
+          <w:sz w:val="28"/>
+          <w:szCs w:val="28"/>
+        </w:rPr>
+        <w:t xml:space="preserve">FAO. (2016). </w:t>
+      </w:r>
+      <w:r>
+        <w:rPr>
+          <w:rFonts w:asciiTheme="minorHAnsi" w:hAnsiTheme="minorHAnsi" w:cstheme="minorHAnsi"/>
+          <w:sz w:val="28"/>
+          <w:szCs w:val="28"/>
+        </w:rPr>
+        <w:t xml:space="preserve">Manual para el mejoramiento del manejo </w:t>
+      </w:r>
+      <w:proofErr w:type="spellStart"/>
+      <w:r>
+        <w:rPr>
+          <w:rFonts w:asciiTheme="minorHAnsi" w:hAnsiTheme="minorHAnsi" w:cstheme="minorHAnsi"/>
+          <w:sz w:val="28"/>
+          <w:szCs w:val="28"/>
+        </w:rPr>
+        <w:t>poscosecha</w:t>
+      </w:r>
+      <w:proofErr w:type="spellEnd"/>
+      <w:r>
+        <w:rPr>
+          <w:rFonts w:asciiTheme="minorHAnsi" w:hAnsiTheme="minorHAnsi" w:cstheme="minorHAnsi"/>
+          <w:sz w:val="28"/>
+          <w:szCs w:val="28"/>
+        </w:rPr>
+        <w:t xml:space="preserve"> de frutas y hortalizas</w:t>
+      </w:r>
+      <w:r>
+        <w:rPr>
+          <w:rFonts w:asciiTheme="minorHAnsi" w:hAnsiTheme="minorHAnsi" w:cstheme="minorHAnsi"/>
+          <w:sz w:val="28"/>
+          <w:szCs w:val="28"/>
+        </w:rPr>
+        <w:t xml:space="preserve">. Organización de las Naciones Unidas para la Alimentación y la Agricultura. </w:t>
+      </w:r>
+      <w:hyperlink r:id="rId20" w:history="1">
         <w:r>
           <w:rPr>
             <w:rStyle w:val="Hipervnculo"/>
@@ -12017,7 +12006,6 @@
     <w:p>
       <w:pPr>
         <w:pStyle w:val="Normal0"/>
-        <w:ind w:firstLine="708"/>
         <w:rPr>
           <w:rFonts w:asciiTheme="minorHAnsi" w:hAnsiTheme="minorHAnsi" w:cstheme="minorHAnsi"/>
           <w:sz w:val="28"/>
@@ -12041,24 +12029,12 @@
           <w:sz w:val="28"/>
           <w:szCs w:val="28"/>
         </w:rPr>
-        <w:t xml:space="preserve">FAO. (2012). Pérdidas y desperdicio de alimentos en el mundo. Roma: Organización de las Naciones Unidas para la Agricultura y la Alimentación. </w:t>
-      </w:r>
-      <w:hyperlink r:id="rId20" w:history="1">
-        <w:r>
-          <w:rPr>
-            <w:rStyle w:val="Hipervnculo"/>
-            <w:rFonts w:asciiTheme="minorHAnsi" w:hAnsiTheme="minorHAnsi" w:cstheme="minorHAnsi"/>
-            <w:sz w:val="28"/>
-            <w:szCs w:val="28"/>
-          </w:rPr>
-          <w:t>https://www.fao.org/4/i2697s/i2697s.pdf</w:t>
-        </w:r>
-      </w:hyperlink>
+        <w:t>González, A., &amp; Pardo, A. (2018). Microorganismos beneficiosos en la conservación de alimentos vegetales. Revista Colombiana de Ciencia y Tecnología de Alimentos, 12(2), 45–52.</w:t>
+      </w:r>
     </w:p>
     <w:p>
       <w:pPr>
         <w:pStyle w:val="Normal0"/>
-        <w:ind w:firstLine="708"/>
         <w:rPr>
           <w:rFonts w:asciiTheme="minorHAnsi" w:hAnsiTheme="minorHAnsi" w:cstheme="minorHAnsi"/>
           <w:sz w:val="28"/>
@@ -12082,36 +12058,23 @@
           <w:sz w:val="28"/>
           <w:szCs w:val="28"/>
         </w:rPr>
-        <w:t>González, A., &amp; Pardo, A. (2018). Microorganismos beneficiosos en la conservación de alimentos vegetales. Revista Colombiana de Ciencia y Tecnología de Alimentos, 12(2), 45–52.</w:t>
-      </w:r>
-    </w:p>
-    <w:p>
-      <w:pPr>
-        <w:pStyle w:val="Normal0"/>
+        <w:t xml:space="preserve">INTA. (2018). </w:t>
+      </w:r>
+      <w:r>
         <w:rPr>
           <w:rFonts w:asciiTheme="minorHAnsi" w:hAnsiTheme="minorHAnsi" w:cstheme="minorHAnsi"/>
           <w:sz w:val="28"/>
           <w:szCs w:val="28"/>
         </w:rPr>
-      </w:pPr>
-    </w:p>
-    <w:p>
-      <w:pPr>
-        <w:pStyle w:val="Normal0"/>
-        <w:ind w:firstLine="708"/>
+        <w:t>Manuel de conservas. Recetas caseras para elaborar</w:t>
+      </w:r>
+      <w:r>
         <w:rPr>
           <w:rFonts w:asciiTheme="minorHAnsi" w:hAnsiTheme="minorHAnsi" w:cstheme="minorHAnsi"/>
           <w:sz w:val="28"/>
           <w:szCs w:val="28"/>
         </w:rPr>
-      </w:pPr>
-      <w:r>
-        <w:rPr>
-          <w:rFonts w:asciiTheme="minorHAnsi" w:hAnsiTheme="minorHAnsi" w:cstheme="minorHAnsi"/>
-          <w:sz w:val="28"/>
-          <w:szCs w:val="28"/>
-        </w:rPr>
-        <w:t>INTA. (2018). Manual de conservación de frutas y hortalizas. Instituto Nacional de Tecnología Agropecuaria.</w:t>
+        <w:t>. Instituto Nacional de Tecnología Agropecuaria.</w:t>
       </w:r>
       <w:r>
         <w:rPr>
@@ -12190,7 +12153,23 @@
           <w:sz w:val="28"/>
           <w:szCs w:val="28"/>
         </w:rPr>
-        <w:t xml:space="preserve">Zapata, S., &amp; Gómez, L. (2015). Sustancias bioactivas en los alimentos y su función en la salud humana. Revista Colombiana de Ciencias Químico-Farmacéuticas, 44(2), 183–198. </w:t>
+        <w:t>Zapata, S., &amp; Gómez, L. (2015). Sustancias bioactivas en los alimentos</w:t>
+      </w:r>
+      <w:r>
+        <w:rPr>
+          <w:rFonts w:asciiTheme="minorHAnsi" w:hAnsiTheme="minorHAnsi" w:cstheme="minorHAnsi"/>
+          <w:sz w:val="28"/>
+          <w:szCs w:val="28"/>
+        </w:rPr>
+        <w:t xml:space="preserve">. </w:t>
+      </w:r>
+      <w:r>
+        <w:rPr>
+          <w:rFonts w:asciiTheme="minorHAnsi" w:hAnsiTheme="minorHAnsi" w:cstheme="minorHAnsi"/>
+          <w:sz w:val="28"/>
+          <w:szCs w:val="28"/>
+        </w:rPr>
+        <w:t xml:space="preserve">Revista Colombiana de Ciencias Químico-Farmacéuticas, 44(2), 183–198. </w:t>
       </w:r>
       <w:hyperlink r:id="rId22" w:history="1">
         <w:r>
@@ -12271,7 +12250,7 @@
       <w:pPr>
         <w:pStyle w:val="Titulosgenerales"/>
       </w:pPr>
-      <w:bookmarkStart w:id="34" w:name="_Toc202291861"/>
+      <w:bookmarkStart w:id="34" w:name="_Toc202984727"/>
       <w:r>
         <w:lastRenderedPageBreak/>
         <w:t>Créditos</w:t>
@@ -15287,7 +15266,7 @@
       <w:lvlText w:val=""/>
       <w:lvlJc w:val="left"/>
       <w:pPr>
-        <w:ind w:left="2138" w:hanging="720"/>
+        <w:ind w:left="2136" w:hanging="720"/>
       </w:pPr>
       <w:rPr>
         <w:rFonts w:ascii="Symbol" w:eastAsiaTheme="minorHAnsi" w:hAnsi="Symbol" w:cstheme="minorBidi" w:hint="default"/>
@@ -15299,7 +15278,7 @@
       <w:lvlText w:val="o"/>
       <w:lvlJc w:val="left"/>
       <w:pPr>
-        <w:ind w:left="2149" w:hanging="360"/>
+        <w:ind w:left="2147" w:hanging="360"/>
       </w:pPr>
       <w:rPr>
         <w:rFonts w:ascii="Courier New" w:hAnsi="Courier New" w:cs="Courier New" w:hint="default"/>
@@ -15311,7 +15290,7 @@
       <w:lvlText w:val=""/>
       <w:lvlJc w:val="left"/>
       <w:pPr>
-        <w:ind w:left="2869" w:hanging="360"/>
+        <w:ind w:left="2867" w:hanging="360"/>
       </w:pPr>
       <w:rPr>
         <w:rFonts w:ascii="Wingdings" w:hAnsi="Wingdings" w:hint="default"/>
@@ -15323,7 +15302,7 @@
       <w:lvlText w:val=""/>
       <w:lvlJc w:val="left"/>
       <w:pPr>
-        <w:ind w:left="3589" w:hanging="360"/>
+        <w:ind w:left="3587" w:hanging="360"/>
       </w:pPr>
       <w:rPr>
         <w:rFonts w:ascii="Symbol" w:hAnsi="Symbol" w:hint="default"/>
@@ -15335,7 +15314,7 @@
       <w:lvlText w:val="o"/>
       <w:lvlJc w:val="left"/>
       <w:pPr>
-        <w:ind w:left="4309" w:hanging="360"/>
+        <w:ind w:left="4307" w:hanging="360"/>
       </w:pPr>
       <w:rPr>
         <w:rFonts w:ascii="Courier New" w:hAnsi="Courier New" w:cs="Courier New" w:hint="default"/>
@@ -15347,7 +15326,7 @@
       <w:lvlText w:val=""/>
       <w:lvlJc w:val="left"/>
       <w:pPr>
-        <w:ind w:left="5029" w:hanging="360"/>
+        <w:ind w:left="5027" w:hanging="360"/>
       </w:pPr>
       <w:rPr>
         <w:rFonts w:ascii="Wingdings" w:hAnsi="Wingdings" w:hint="default"/>
@@ -15359,7 +15338,7 @@
       <w:lvlText w:val=""/>
       <w:lvlJc w:val="left"/>
       <w:pPr>
-        <w:ind w:left="5749" w:hanging="360"/>
+        <w:ind w:left="5747" w:hanging="360"/>
       </w:pPr>
       <w:rPr>
         <w:rFonts w:ascii="Symbol" w:hAnsi="Symbol" w:hint="default"/>
@@ -15371,7 +15350,7 @@
       <w:lvlText w:val="o"/>
       <w:lvlJc w:val="left"/>
       <w:pPr>
-        <w:ind w:left="6469" w:hanging="360"/>
+        <w:ind w:left="6467" w:hanging="360"/>
       </w:pPr>
       <w:rPr>
         <w:rFonts w:ascii="Courier New" w:hAnsi="Courier New" w:cs="Courier New" w:hint="default"/>
@@ -15383,7 +15362,7 @@
       <w:lvlText w:val=""/>
       <w:lvlJc w:val="left"/>
       <w:pPr>
-        <w:ind w:left="7189" w:hanging="360"/>
+        <w:ind w:left="7187" w:hanging="360"/>
       </w:pPr>
       <w:rPr>
         <w:rFonts w:ascii="Wingdings" w:hAnsi="Wingdings" w:hint="default"/>
@@ -21604,7 +21583,7 @@
     <w:uiPriority w:val="9"/>
     <w:unhideWhenUsed/>
     <w:qFormat/>
-    <w:rsid w:val="00A80960"/>
+    <w:rsid w:val="00531B67"/>
     <w:pPr>
       <w:keepNext/>
       <w:keepLines/>
@@ -21691,6 +21670,7 @@
   <w:style w:type="character" w:default="1" w:styleId="Fuentedeprrafopredeter">
     <w:name w:val="Default Paragraph Font"/>
     <w:uiPriority w:val="1"/>
+    <w:semiHidden/>
     <w:unhideWhenUsed/>
   </w:style>
   <w:style w:type="table" w:default="1" w:styleId="Tablanormal">
@@ -21763,7 +21743,7 @@
     <w:basedOn w:val="Fuentedeprrafopredeter"/>
     <w:link w:val="Ttulo2"/>
     <w:uiPriority w:val="9"/>
-    <w:rsid w:val="00A80960"/>
+    <w:rsid w:val="00531B67"/>
     <w:rPr>
       <w:rFonts w:ascii="Calibri" w:eastAsiaTheme="majorEastAsia" w:hAnsi="Calibri" w:cstheme="majorBidi"/>
       <w:b/>
@@ -22745,6 +22725,17 @@
 </file>
 
 <file path=customXml/item1.xml><?xml version="1.0" encoding="utf-8"?>
+<p:properties xmlns:p="http://schemas.microsoft.com/office/2006/metadata/properties" xmlns:xsi="http://www.w3.org/2001/XMLSchema-instance" xmlns:pc="http://schemas.microsoft.com/office/infopath/2007/PartnerControls">
+  <documentManagement>
+    <TaxCatchAll xmlns="cb45339b-ced9-4d0d-8f64-77573914d53b" xsi:nil="true"/>
+    <lcf76f155ced4ddcb4097134ff3c332f xmlns="43a3ca16-9c26-4813-b83f-4aec9927b43f">
+      <Terms xmlns="http://schemas.microsoft.com/office/infopath/2007/PartnerControls"/>
+    </lcf76f155ced4ddcb4097134ff3c332f>
+  </documentManagement>
+</p:properties>
+</file>
+
+<file path=customXml/item2.xml><?xml version="1.0" encoding="utf-8"?>
 <ct:contentTypeSchema xmlns:ct="http://schemas.microsoft.com/office/2006/metadata/contentType" xmlns:ma="http://schemas.microsoft.com/office/2006/metadata/properties/metaAttributes" ct:_="" ma:_="" ma:contentTypeName="Documento" ma:contentTypeID="0x01010049282E1EDBE9234EA9E6D38F720E265F" ma:contentTypeVersion="15" ma:contentTypeDescription="Crear nuevo documento." ma:contentTypeScope="" ma:versionID="b31c7aa9eaf043a08b87120b3c4916e3">
   <xsd:schema xmlns:xsd="http://www.w3.org/2001/XMLSchema" xmlns:xs="http://www.w3.org/2001/XMLSchema" xmlns:p="http://schemas.microsoft.com/office/2006/metadata/properties" xmlns:ns2="cb45339b-ced9-4d0d-8f64-77573914d53b" xmlns:ns3="43a3ca16-9c26-4813-b83f-4aec9927b43f" targetNamespace="http://schemas.microsoft.com/office/2006/metadata/properties" ma:root="true" ma:fieldsID="3533d065b04d75c457075bc55f1f5315" ns2:_="" ns3:_="">
     <xsd:import namespace="cb45339b-ced9-4d0d-8f64-77573914d53b"/>
@@ -22979,22 +22970,7 @@
 </ct:contentTypeSchema>
 </file>
 
-<file path=customXml/item2.xml><?xml version="1.0" encoding="utf-8"?>
-<p:properties xmlns:p="http://schemas.microsoft.com/office/2006/metadata/properties" xmlns:xsi="http://www.w3.org/2001/XMLSchema-instance" xmlns:pc="http://schemas.microsoft.com/office/infopath/2007/PartnerControls">
-  <documentManagement>
-    <TaxCatchAll xmlns="cb45339b-ced9-4d0d-8f64-77573914d53b" xsi:nil="true"/>
-    <lcf76f155ced4ddcb4097134ff3c332f xmlns="43a3ca16-9c26-4813-b83f-4aec9927b43f">
-      <Terms xmlns="http://schemas.microsoft.com/office/infopath/2007/PartnerControls"/>
-    </lcf76f155ced4ddcb4097134ff3c332f>
-  </documentManagement>
-</p:properties>
-</file>
-
 <file path=customXml/item3.xml><?xml version="1.0" encoding="utf-8"?>
-<b:Sources xmlns:b="http://schemas.openxmlformats.org/officeDocument/2006/bibliography" xmlns="http://schemas.openxmlformats.org/officeDocument/2006/bibliography" SelectedStyle="\APASixthEditionOfficeOnline.xsl" StyleName="APA" Version="6"/>
-</file>
-
-<file path=customXml/item4.xml><?xml version="1.0" encoding="utf-8"?>
 <?mso-contentType ?>
 <FormTemplates xmlns="http://schemas.microsoft.com/sharepoint/v3/contenttype/forms">
   <Display>DocumentLibraryForm</Display>
@@ -23003,7 +22979,22 @@
 </FormTemplates>
 </file>
 
+<file path=customXml/item4.xml><?xml version="1.0" encoding="utf-8"?>
+<b:Sources xmlns:b="http://schemas.openxmlformats.org/officeDocument/2006/bibliography" xmlns="http://schemas.openxmlformats.org/officeDocument/2006/bibliography" SelectedStyle="\APASixthEditionOfficeOnline.xsl" StyleName="APA" Version="6"/>
+</file>
+
 <file path=customXml/itemProps1.xml><?xml version="1.0" encoding="utf-8"?>
+<ds:datastoreItem xmlns:ds="http://schemas.openxmlformats.org/officeDocument/2006/customXml" ds:itemID="{6929C9FE-9F22-4B98-96EF-1B541B3BD0B2}">
+  <ds:schemaRefs>
+    <ds:schemaRef ds:uri="http://schemas.microsoft.com/office/2006/metadata/properties"/>
+    <ds:schemaRef ds:uri="http://schemas.microsoft.com/office/infopath/2007/PartnerControls"/>
+    <ds:schemaRef ds:uri="cb45339b-ced9-4d0d-8f64-77573914d53b"/>
+    <ds:schemaRef ds:uri="43a3ca16-9c26-4813-b83f-4aec9927b43f"/>
+  </ds:schemaRefs>
+</ds:datastoreItem>
+</file>
+
+<file path=customXml/itemProps2.xml><?xml version="1.0" encoding="utf-8"?>
 <ds:datastoreItem xmlns:ds="http://schemas.openxmlformats.org/officeDocument/2006/customXml" ds:itemID="{DF43E046-DB0C-42D1-8C73-AE38B52F1ED7}">
   <ds:schemaRefs>
     <ds:schemaRef ds:uri="http://schemas.microsoft.com/office/2006/metadata/contentType"/>
@@ -23022,29 +23013,18 @@
 </ds:datastoreItem>
 </file>
 
-<file path=customXml/itemProps2.xml><?xml version="1.0" encoding="utf-8"?>
-<ds:datastoreItem xmlns:ds="http://schemas.openxmlformats.org/officeDocument/2006/customXml" ds:itemID="{6929C9FE-9F22-4B98-96EF-1B541B3BD0B2}">
+<file path=customXml/itemProps3.xml><?xml version="1.0" encoding="utf-8"?>
+<ds:datastoreItem xmlns:ds="http://schemas.openxmlformats.org/officeDocument/2006/customXml" ds:itemID="{81CBDEC1-3B00-44ED-AD36-0268077980BA}">
   <ds:schemaRefs>
-    <ds:schemaRef ds:uri="http://schemas.microsoft.com/office/2006/metadata/properties"/>
-    <ds:schemaRef ds:uri="http://schemas.microsoft.com/office/infopath/2007/PartnerControls"/>
-    <ds:schemaRef ds:uri="cb45339b-ced9-4d0d-8f64-77573914d53b"/>
-    <ds:schemaRef ds:uri="43a3ca16-9c26-4813-b83f-4aec9927b43f"/>
+    <ds:schemaRef ds:uri="http://schemas.microsoft.com/sharepoint/v3/contenttype/forms"/>
   </ds:schemaRefs>
 </ds:datastoreItem>
 </file>
 
-<file path=customXml/itemProps3.xml><?xml version="1.0" encoding="utf-8"?>
+<file path=customXml/itemProps4.xml><?xml version="1.0" encoding="utf-8"?>
 <ds:datastoreItem xmlns:ds="http://schemas.openxmlformats.org/officeDocument/2006/customXml" ds:itemID="{E8AB44A3-7C62-4BD2-82ED-8ABC209970FA}">
   <ds:schemaRefs>
     <ds:schemaRef ds:uri="http://schemas.openxmlformats.org/officeDocument/2006/bibliography"/>
   </ds:schemaRefs>
 </ds:datastoreItem>
-</file>
-
-<file path=customXml/itemProps4.xml><?xml version="1.0" encoding="utf-8"?>
-<ds:datastoreItem xmlns:ds="http://schemas.openxmlformats.org/officeDocument/2006/customXml" ds:itemID="{81CBDEC1-3B00-44ED-AD36-0268077980BA}">
-  <ds:schemaRefs>
-    <ds:schemaRef ds:uri="http://schemas.microsoft.com/sharepoint/v3/contenttype/forms"/>
-  </ds:schemaRefs>
-</ds:datastoreItem>
 </file>
</xml_diff>